<commit_message>
Update environment setup documentation
</commit_message>
<xml_diff>
--- a/Distributed_Systems_Midterm_Documentation.docx
+++ b/Distributed_Systems_Midterm_Documentation.docx
@@ -2,7 +2,1334 @@
 <file path=word/document.xml><?xml version="1.0" encoding="utf-8"?>
 <w:document xmlns:wpc="http://schemas.microsoft.com/office/word/2010/wordprocessingCanvas" xmlns:cx="http://schemas.microsoft.com/office/drawing/2014/chartex" xmlns:cx1="http://schemas.microsoft.com/office/drawing/2015/9/8/chartex" xmlns:cx2="http://schemas.microsoft.com/office/drawing/2015/10/21/chartex" xmlns:cx3="http://schemas.microsoft.com/office/drawing/2016/5/9/chartex" xmlns:cx4="http://schemas.microsoft.com/office/drawing/2016/5/10/chartex" xmlns:cx5="http://schemas.microsoft.com/office/drawing/2016/5/11/chartex" xmlns:cx6="http://schemas.microsoft.com/office/drawing/2016/5/12/chartex" xmlns:cx7="http://schemas.microsoft.com/office/drawing/2016/5/13/chartex" xmlns:cx8="http://schemas.microsoft.com/office/drawing/2016/5/14/chartex" xmlns:mc="http://schemas.openxmlformats.org/markup-compatibility/2006" xmlns:aink="http://schemas.microsoft.com/office/drawing/2016/ink" xmlns:am3d="http://schemas.microsoft.com/office/drawing/2017/model3d" xmlns:o="urn:schemas-microsoft-com:office:office" xmlns:oel="http://schemas.microsoft.com/office/2019/extlst" xmlns:r="http://schemas.openxmlformats.org/officeDocument/2006/relationships" xmlns:m="http://schemas.openxmlformats.org/officeDocument/2006/math" xmlns:v="urn:schemas-microsoft-com:vml" xmlns:wp14="http://schemas.microsoft.com/office/word/2010/wordprocessingDrawing" xmlns:wp="http://schemas.openxmlformats.org/drawingml/2006/wordprocessingDrawing" xmlns:w10="urn:schemas-microsoft-com:office:word" xmlns:w="http://schemas.openxmlformats.org/wordprocessingml/2006/main" xmlns:w14="http://schemas.microsoft.com/office/word/2010/wordml" xmlns:w15="http://schemas.microsoft.com/office/word/2012/wordml" xmlns:w16cex="http://schemas.microsoft.com/office/word/2018/wordml/cex" xmlns:w16cid="http://schemas.microsoft.com/office/word/2016/wordml/cid" xmlns:w16="http://schemas.microsoft.com/office/word/2018/wordml" xmlns:w16du="http://schemas.microsoft.com/office/word/2023/wordml/word16du" xmlns:w16sdtdh="http://schemas.microsoft.com/office/word/2020/wordml/sdtdatahash" xmlns:w16sdtfl="http://schemas.microsoft.com/office/word/2024/wordml/sdtformatlock" xmlns:w16se="http://schemas.microsoft.com/office/word/2015/wordml/symex" xmlns:wpg="http://schemas.microsoft.com/office/word/2010/wordprocessingGroup" xmlns:wpi="http://schemas.microsoft.com/office/word/2010/wordprocessingInk" xmlns:wne="http://schemas.microsoft.com/office/word/2006/wordml" xmlns:wps="http://schemas.microsoft.com/office/word/2010/wordprocessingShape" mc:Ignorable="w14 w15 w16se w16cid w16 w16cex w16sdtdh w16sdtfl w16du wp14">
   <w:body>
-    <w:p/>
+    <w:p>
+      <w:pPr>
+        <w:rPr>
+          <w:rFonts w:asciiTheme="majorBidi" w:hAnsiTheme="majorBidi" w:cstheme="majorBidi"/>
+          <w:b/>
+          <w:bCs/>
+        </w:rPr>
+      </w:pPr>
+      <w:r>
+        <w:rPr>
+          <w:rFonts w:asciiTheme="majorBidi" w:hAnsiTheme="majorBidi" w:cstheme="majorBidi"/>
+          <w:b/>
+          <w:bCs/>
+        </w:rPr>
+        <w:t>Distributed Systems — Midterm Project</w:t>
+      </w:r>
+    </w:p>
+    <w:p>
+      <w:pPr>
+        <w:rPr>
+          <w:rFonts w:asciiTheme="majorBidi" w:hAnsiTheme="majorBidi" w:cstheme="majorBidi"/>
+          <w:b/>
+          <w:bCs/>
+        </w:rPr>
+      </w:pPr>
+      <w:r>
+        <w:rPr>
+          <w:rFonts w:asciiTheme="majorBidi" w:hAnsiTheme="majorBidi" w:cstheme="majorBidi"/>
+          <w:b/>
+          <w:bCs/>
+        </w:rPr>
+        <w:t>1. Environment Setup</w:t>
+      </w:r>
+    </w:p>
+    <w:p>
+      <w:pPr>
+        <w:rPr>
+          <w:rFonts w:asciiTheme="majorBidi" w:hAnsiTheme="majorBidi" w:cstheme="majorBidi"/>
+        </w:rPr>
+      </w:pPr>
+      <w:r>
+        <w:rPr>
+          <w:rFonts w:asciiTheme="majorBidi" w:hAnsiTheme="majorBidi" w:cstheme="majorBidi"/>
+          <w:b/>
+          <w:bCs/>
+        </w:rPr>
+        <w:t>Project Name:</w:t>
+      </w:r>
+      <w:r>
+        <w:rPr>
+          <w:rFonts w:asciiTheme="majorBidi" w:hAnsiTheme="majorBidi" w:cstheme="majorBidi"/>
+        </w:rPr>
+        <w:t xml:space="preserve"> Distributed-Systems-Midterm</w:t>
+      </w:r>
+    </w:p>
+    <w:p>
+      <w:pPr>
+        <w:rPr>
+          <w:rFonts w:asciiTheme="majorBidi" w:hAnsiTheme="majorBidi" w:cstheme="majorBidi"/>
+        </w:rPr>
+      </w:pPr>
+      <w:r>
+        <w:rPr>
+          <w:rFonts w:asciiTheme="majorBidi" w:hAnsiTheme="majorBidi" w:cstheme="majorBidi"/>
+          <w:b/>
+          <w:bCs/>
+        </w:rPr>
+        <w:t>Development Environment:</w:t>
+      </w:r>
+      <w:r>
+        <w:rPr>
+          <w:rFonts w:asciiTheme="majorBidi" w:hAnsiTheme="majorBidi" w:cstheme="majorBidi"/>
+        </w:rPr>
+        <w:t xml:space="preserve"> Windows, PyCharm</w:t>
+      </w:r>
+    </w:p>
+    <w:p>
+      <w:pPr>
+        <w:rPr>
+          <w:rFonts w:asciiTheme="majorBidi" w:hAnsiTheme="majorBidi" w:cstheme="majorBidi"/>
+          <w:b/>
+          <w:bCs/>
+        </w:rPr>
+      </w:pPr>
+      <w:r>
+        <w:rPr>
+          <w:rFonts w:asciiTheme="majorBidi" w:hAnsiTheme="majorBidi" w:cstheme="majorBidi"/>
+          <w:b/>
+          <w:bCs/>
+        </w:rPr>
+        <w:t>1.1 Python and Virtual Environment</w:t>
+      </w:r>
+    </w:p>
+    <w:p>
+      <w:pPr>
+        <w:numPr>
+          <w:ilvl w:val="0"/>
+          <w:numId w:val="1"/>
+        </w:numPr>
+        <w:rPr>
+          <w:rFonts w:asciiTheme="majorBidi" w:hAnsiTheme="majorBidi" w:cstheme="majorBidi"/>
+        </w:rPr>
+      </w:pPr>
+      <w:r>
+        <w:rPr>
+          <w:rFonts w:asciiTheme="majorBidi" w:hAnsiTheme="majorBidi" w:cstheme="majorBidi"/>
+        </w:rPr>
+        <w:t>Created the Distributed-Systems-Midterm project in PyCharm.</w:t>
+      </w:r>
+    </w:p>
+    <w:p>
+      <w:pPr>
+        <w:numPr>
+          <w:ilvl w:val="0"/>
+          <w:numId w:val="1"/>
+        </w:numPr>
+        <w:rPr>
+          <w:rFonts w:asciiTheme="majorBidi" w:hAnsiTheme="majorBidi" w:cstheme="majorBidi"/>
+        </w:rPr>
+      </w:pPr>
+      <w:r>
+        <w:rPr>
+          <w:rFonts w:asciiTheme="majorBidi" w:hAnsiTheme="majorBidi" w:cstheme="majorBidi"/>
+        </w:rPr>
+        <w:t>Configured a Python virtual environment (.</w:t>
+      </w:r>
+      <w:proofErr w:type="spellStart"/>
+      <w:r>
+        <w:rPr>
+          <w:rFonts w:asciiTheme="majorBidi" w:hAnsiTheme="majorBidi" w:cstheme="majorBidi"/>
+        </w:rPr>
+        <w:t>venv</w:t>
+      </w:r>
+      <w:proofErr w:type="spellEnd"/>
+      <w:r>
+        <w:rPr>
+          <w:rFonts w:asciiTheme="majorBidi" w:hAnsiTheme="majorBidi" w:cstheme="majorBidi"/>
+        </w:rPr>
+        <w:t>).</w:t>
+      </w:r>
+    </w:p>
+    <w:p>
+      <w:pPr>
+        <w:numPr>
+          <w:ilvl w:val="0"/>
+          <w:numId w:val="1"/>
+        </w:numPr>
+        <w:rPr>
+          <w:rFonts w:asciiTheme="majorBidi" w:hAnsiTheme="majorBidi" w:cstheme="majorBidi"/>
+        </w:rPr>
+      </w:pPr>
+      <w:r>
+        <w:rPr>
+          <w:rFonts w:asciiTheme="majorBidi" w:hAnsiTheme="majorBidi" w:cstheme="majorBidi"/>
+        </w:rPr>
+        <w:t>Installed the required Python libraries: Flask, Requests, Prometheus Client, Kafka-Python, and Pika.</w:t>
+      </w:r>
+    </w:p>
+    <w:p>
+      <w:pPr>
+        <w:rPr>
+          <w:rFonts w:asciiTheme="majorBidi" w:hAnsiTheme="majorBidi" w:cstheme="majorBidi"/>
+        </w:rPr>
+      </w:pPr>
+      <w:r>
+        <w:rPr>
+          <w:rFonts w:asciiTheme="majorBidi" w:hAnsiTheme="majorBidi" w:cstheme="majorBidi"/>
+        </w:rPr>
+        <w:drawing>
+          <wp:inline distT="0" distB="0" distL="0" distR="0" wp14:anchorId="0DD3BC05" wp14:editId="3E99F233">
+            <wp:extent cx="5943600" cy="3112135"/>
+            <wp:effectExtent l="0" t="0" r="0" b="0"/>
+            <wp:docPr id="1825088190" name="Picture 1"/>
+            <wp:cNvGraphicFramePr>
+              <a:graphicFrameLocks xmlns:a="http://schemas.openxmlformats.org/drawingml/2006/main" noChangeAspect="1"/>
+            </wp:cNvGraphicFramePr>
+            <a:graphic xmlns:a="http://schemas.openxmlformats.org/drawingml/2006/main">
+              <a:graphicData uri="http://schemas.openxmlformats.org/drawingml/2006/picture">
+                <pic:pic xmlns:pic="http://schemas.openxmlformats.org/drawingml/2006/picture">
+                  <pic:nvPicPr>
+                    <pic:cNvPr id="1825088190" name=""/>
+                    <pic:cNvPicPr/>
+                  </pic:nvPicPr>
+                  <pic:blipFill>
+                    <a:blip r:embed="rId5"/>
+                    <a:stretch>
+                      <a:fillRect/>
+                    </a:stretch>
+                  </pic:blipFill>
+                  <pic:spPr>
+                    <a:xfrm>
+                      <a:off x="0" y="0"/>
+                      <a:ext cx="5943600" cy="3112135"/>
+                    </a:xfrm>
+                    <a:prstGeom prst="rect">
+                      <a:avLst/>
+                    </a:prstGeom>
+                  </pic:spPr>
+                </pic:pic>
+              </a:graphicData>
+            </a:graphic>
+          </wp:inline>
+        </w:drawing>
+      </w:r>
+    </w:p>
+    <w:p>
+      <w:pPr>
+        <w:rPr>
+          <w:rFonts w:asciiTheme="majorBidi" w:hAnsiTheme="majorBidi" w:cstheme="majorBidi"/>
+          <w:b/>
+          <w:bCs/>
+        </w:rPr>
+      </w:pPr>
+      <w:r>
+        <w:rPr>
+          <w:rFonts w:asciiTheme="majorBidi" w:hAnsiTheme="majorBidi" w:cstheme="majorBidi"/>
+          <w:b/>
+          <w:bCs/>
+        </w:rPr>
+        <w:t>1.2 Git and GitHub</w:t>
+      </w:r>
+    </w:p>
+    <w:p>
+      <w:pPr>
+        <w:numPr>
+          <w:ilvl w:val="0"/>
+          <w:numId w:val="2"/>
+        </w:numPr>
+        <w:rPr>
+          <w:rFonts w:asciiTheme="majorBidi" w:hAnsiTheme="majorBidi" w:cstheme="majorBidi"/>
+        </w:rPr>
+      </w:pPr>
+      <w:r>
+        <w:rPr>
+          <w:rFonts w:asciiTheme="majorBidi" w:hAnsiTheme="majorBidi" w:cstheme="majorBidi"/>
+        </w:rPr>
+        <w:t>Verified the Git installation.</w:t>
+      </w:r>
+    </w:p>
+    <w:p>
+      <w:pPr>
+        <w:numPr>
+          <w:ilvl w:val="0"/>
+          <w:numId w:val="2"/>
+        </w:numPr>
+        <w:rPr>
+          <w:rFonts w:asciiTheme="majorBidi" w:hAnsiTheme="majorBidi" w:cstheme="majorBidi"/>
+        </w:rPr>
+      </w:pPr>
+      <w:r>
+        <w:rPr>
+          <w:rFonts w:asciiTheme="majorBidi" w:hAnsiTheme="majorBidi" w:cstheme="majorBidi"/>
+        </w:rPr>
+        <w:t>Initialized a local Git repository.</w:t>
+      </w:r>
+    </w:p>
+    <w:p>
+      <w:pPr>
+        <w:numPr>
+          <w:ilvl w:val="0"/>
+          <w:numId w:val="2"/>
+        </w:numPr>
+        <w:rPr>
+          <w:rFonts w:asciiTheme="majorBidi" w:hAnsiTheme="majorBidi" w:cstheme="majorBidi"/>
+        </w:rPr>
+      </w:pPr>
+      <w:r>
+        <w:rPr>
+          <w:rFonts w:asciiTheme="majorBidi" w:hAnsiTheme="majorBidi" w:cstheme="majorBidi"/>
+        </w:rPr>
+        <w:t>Configured the main branch.</w:t>
+      </w:r>
+    </w:p>
+    <w:p>
+      <w:pPr>
+        <w:numPr>
+          <w:ilvl w:val="0"/>
+          <w:numId w:val="2"/>
+        </w:numPr>
+        <w:rPr>
+          <w:rFonts w:asciiTheme="majorBidi" w:hAnsiTheme="majorBidi" w:cstheme="majorBidi"/>
+        </w:rPr>
+      </w:pPr>
+      <w:r>
+        <w:rPr>
+          <w:rFonts w:asciiTheme="majorBidi" w:hAnsiTheme="majorBidi" w:cstheme="majorBidi"/>
+        </w:rPr>
+        <w:t xml:space="preserve">Added </w:t>
+      </w:r>
+      <w:proofErr w:type="gramStart"/>
+      <w:r>
+        <w:rPr>
+          <w:rFonts w:asciiTheme="majorBidi" w:hAnsiTheme="majorBidi" w:cstheme="majorBidi"/>
+        </w:rPr>
+        <w:t>a .</w:t>
+      </w:r>
+      <w:proofErr w:type="spellStart"/>
+      <w:r>
+        <w:rPr>
+          <w:rFonts w:asciiTheme="majorBidi" w:hAnsiTheme="majorBidi" w:cstheme="majorBidi"/>
+        </w:rPr>
+        <w:t>gitignore</w:t>
+      </w:r>
+      <w:proofErr w:type="spellEnd"/>
+      <w:proofErr w:type="gramEnd"/>
+      <w:r>
+        <w:rPr>
+          <w:rFonts w:asciiTheme="majorBidi" w:hAnsiTheme="majorBidi" w:cstheme="majorBidi"/>
+        </w:rPr>
+        <w:t xml:space="preserve"> file to exclude unnecessary files.</w:t>
+      </w:r>
+    </w:p>
+    <w:p>
+      <w:pPr>
+        <w:numPr>
+          <w:ilvl w:val="0"/>
+          <w:numId w:val="2"/>
+        </w:numPr>
+        <w:rPr>
+          <w:rFonts w:asciiTheme="majorBidi" w:hAnsiTheme="majorBidi" w:cstheme="majorBidi"/>
+        </w:rPr>
+      </w:pPr>
+      <w:r>
+        <w:rPr>
+          <w:rFonts w:asciiTheme="majorBidi" w:hAnsiTheme="majorBidi" w:cstheme="majorBidi"/>
+        </w:rPr>
+        <w:t>Created the initial project commit.</w:t>
+      </w:r>
+    </w:p>
+    <w:p>
+      <w:pPr>
+        <w:rPr>
+          <w:rFonts w:asciiTheme="majorBidi" w:hAnsiTheme="majorBidi" w:cstheme="majorBidi"/>
+        </w:rPr>
+      </w:pPr>
+      <w:r>
+        <w:rPr>
+          <w:rFonts w:asciiTheme="majorBidi" w:hAnsiTheme="majorBidi" w:cstheme="majorBidi"/>
+        </w:rPr>
+        <w:lastRenderedPageBreak/>
+        <w:drawing>
+          <wp:inline distT="0" distB="0" distL="0" distR="0" wp14:anchorId="4542DE4A" wp14:editId="6309FA9A">
+            <wp:extent cx="5943600" cy="3088005"/>
+            <wp:effectExtent l="0" t="0" r="0" b="0"/>
+            <wp:docPr id="2124080608" name="Picture 1"/>
+            <wp:cNvGraphicFramePr>
+              <a:graphicFrameLocks xmlns:a="http://schemas.openxmlformats.org/drawingml/2006/main" noChangeAspect="1"/>
+            </wp:cNvGraphicFramePr>
+            <a:graphic xmlns:a="http://schemas.openxmlformats.org/drawingml/2006/main">
+              <a:graphicData uri="http://schemas.openxmlformats.org/drawingml/2006/picture">
+                <pic:pic xmlns:pic="http://schemas.openxmlformats.org/drawingml/2006/picture">
+                  <pic:nvPicPr>
+                    <pic:cNvPr id="2124080608" name=""/>
+                    <pic:cNvPicPr/>
+                  </pic:nvPicPr>
+                  <pic:blipFill>
+                    <a:blip r:embed="rId6"/>
+                    <a:stretch>
+                      <a:fillRect/>
+                    </a:stretch>
+                  </pic:blipFill>
+                  <pic:spPr>
+                    <a:xfrm>
+                      <a:off x="0" y="0"/>
+                      <a:ext cx="5943600" cy="3088005"/>
+                    </a:xfrm>
+                    <a:prstGeom prst="rect">
+                      <a:avLst/>
+                    </a:prstGeom>
+                  </pic:spPr>
+                </pic:pic>
+              </a:graphicData>
+            </a:graphic>
+          </wp:inline>
+        </w:drawing>
+      </w:r>
+    </w:p>
+    <w:p>
+      <w:pPr>
+        <w:rPr>
+          <w:rFonts w:asciiTheme="majorBidi" w:hAnsiTheme="majorBidi" w:cstheme="majorBidi"/>
+          <w:b/>
+          <w:bCs/>
+        </w:rPr>
+      </w:pPr>
+      <w:r>
+        <w:rPr>
+          <w:rFonts w:asciiTheme="majorBidi" w:hAnsiTheme="majorBidi" w:cstheme="majorBidi"/>
+          <w:b/>
+          <w:bCs/>
+        </w:rPr>
+        <w:t>1.3 Docker</w:t>
+      </w:r>
+    </w:p>
+    <w:p>
+      <w:pPr>
+        <w:numPr>
+          <w:ilvl w:val="0"/>
+          <w:numId w:val="3"/>
+        </w:numPr>
+        <w:rPr>
+          <w:rFonts w:asciiTheme="majorBidi" w:hAnsiTheme="majorBidi" w:cstheme="majorBidi"/>
+        </w:rPr>
+      </w:pPr>
+      <w:r>
+        <w:rPr>
+          <w:rFonts w:asciiTheme="majorBidi" w:hAnsiTheme="majorBidi" w:cstheme="majorBidi"/>
+        </w:rPr>
+        <w:t>Configured Docker Desktop.</w:t>
+      </w:r>
+    </w:p>
+    <w:p>
+      <w:pPr>
+        <w:numPr>
+          <w:ilvl w:val="0"/>
+          <w:numId w:val="3"/>
+        </w:numPr>
+        <w:rPr>
+          <w:rFonts w:asciiTheme="majorBidi" w:hAnsiTheme="majorBidi" w:cstheme="majorBidi"/>
+        </w:rPr>
+      </w:pPr>
+      <w:r>
+        <w:rPr>
+          <w:rFonts w:asciiTheme="majorBidi" w:hAnsiTheme="majorBidi" w:cstheme="majorBidi"/>
+        </w:rPr>
+        <w:t>Verified Docker installation and connectivity.</w:t>
+      </w:r>
+    </w:p>
+    <w:p>
+      <w:pPr>
+        <w:numPr>
+          <w:ilvl w:val="0"/>
+          <w:numId w:val="3"/>
+        </w:numPr>
+        <w:rPr>
+          <w:rFonts w:asciiTheme="majorBidi" w:hAnsiTheme="majorBidi" w:cstheme="majorBidi"/>
+        </w:rPr>
+      </w:pPr>
+      <w:r>
+        <w:rPr>
+          <w:rFonts w:asciiTheme="majorBidi" w:hAnsiTheme="majorBidi" w:cstheme="majorBidi"/>
+        </w:rPr>
+        <w:t>Executed the hello-world container successfully.</w:t>
+      </w:r>
+    </w:p>
+    <w:p>
+      <w:pPr>
+        <w:numPr>
+          <w:ilvl w:val="0"/>
+          <w:numId w:val="3"/>
+        </w:numPr>
+        <w:rPr>
+          <w:rFonts w:asciiTheme="majorBidi" w:hAnsiTheme="majorBidi" w:cstheme="majorBidi"/>
+        </w:rPr>
+      </w:pPr>
+      <w:r>
+        <w:rPr>
+          <w:rFonts w:asciiTheme="majorBidi" w:hAnsiTheme="majorBidi" w:cstheme="majorBidi"/>
+        </w:rPr>
+        <w:t xml:space="preserve">Created a </w:t>
+      </w:r>
+      <w:proofErr w:type="spellStart"/>
+      <w:r>
+        <w:rPr>
+          <w:rFonts w:asciiTheme="majorBidi" w:hAnsiTheme="majorBidi" w:cstheme="majorBidi"/>
+        </w:rPr>
+        <w:t>Dockerfile</w:t>
+      </w:r>
+      <w:proofErr w:type="spellEnd"/>
+      <w:r>
+        <w:rPr>
+          <w:rFonts w:asciiTheme="majorBidi" w:hAnsiTheme="majorBidi" w:cstheme="majorBidi"/>
+        </w:rPr>
+        <w:t xml:space="preserve"> and a Docker Compose configuration for the project.</w:t>
+      </w:r>
+    </w:p>
+    <w:p>
+      <w:pPr>
+        <w:rPr>
+          <w:rFonts w:asciiTheme="majorBidi" w:hAnsiTheme="majorBidi" w:cstheme="majorBidi"/>
+          <w:b/>
+          <w:bCs/>
+        </w:rPr>
+      </w:pPr>
+      <w:r>
+        <w:rPr>
+          <w:rFonts w:asciiTheme="majorBidi" w:hAnsiTheme="majorBidi" w:cstheme="majorBidi"/>
+          <w:b/>
+          <w:bCs/>
+        </w:rPr>
+        <w:drawing>
+          <wp:inline distT="0" distB="0" distL="0" distR="0" wp14:anchorId="213D2B6B" wp14:editId="4FE780C0">
+            <wp:extent cx="5943600" cy="3114040"/>
+            <wp:effectExtent l="0" t="0" r="0" b="0"/>
+            <wp:docPr id="2041105314" name="Picture 1"/>
+            <wp:cNvGraphicFramePr>
+              <a:graphicFrameLocks xmlns:a="http://schemas.openxmlformats.org/drawingml/2006/main" noChangeAspect="1"/>
+            </wp:cNvGraphicFramePr>
+            <a:graphic xmlns:a="http://schemas.openxmlformats.org/drawingml/2006/main">
+              <a:graphicData uri="http://schemas.openxmlformats.org/drawingml/2006/picture">
+                <pic:pic xmlns:pic="http://schemas.openxmlformats.org/drawingml/2006/picture">
+                  <pic:nvPicPr>
+                    <pic:cNvPr id="2041105314" name=""/>
+                    <pic:cNvPicPr/>
+                  </pic:nvPicPr>
+                  <pic:blipFill>
+                    <a:blip r:embed="rId7"/>
+                    <a:stretch>
+                      <a:fillRect/>
+                    </a:stretch>
+                  </pic:blipFill>
+                  <pic:spPr>
+                    <a:xfrm>
+                      <a:off x="0" y="0"/>
+                      <a:ext cx="5943600" cy="3114040"/>
+                    </a:xfrm>
+                    <a:prstGeom prst="rect">
+                      <a:avLst/>
+                    </a:prstGeom>
+                  </pic:spPr>
+                </pic:pic>
+              </a:graphicData>
+            </a:graphic>
+          </wp:inline>
+        </w:drawing>
+      </w:r>
+    </w:p>
+    <w:p>
+      <w:pPr>
+        <w:rPr>
+          <w:rFonts w:asciiTheme="majorBidi" w:hAnsiTheme="majorBidi" w:cstheme="majorBidi"/>
+          <w:b/>
+          <w:bCs/>
+        </w:rPr>
+      </w:pPr>
+    </w:p>
+    <w:p>
+      <w:pPr>
+        <w:rPr>
+          <w:rFonts w:asciiTheme="majorBidi" w:hAnsiTheme="majorBidi" w:cstheme="majorBidi"/>
+          <w:b/>
+          <w:bCs/>
+        </w:rPr>
+      </w:pPr>
+      <w:r>
+        <w:rPr>
+          <w:rFonts w:asciiTheme="majorBidi" w:hAnsiTheme="majorBidi" w:cstheme="majorBidi"/>
+          <w:b/>
+          <w:bCs/>
+        </w:rPr>
+        <w:lastRenderedPageBreak/>
+        <w:t>1.4 Kubernetes</w:t>
+      </w:r>
+    </w:p>
+    <w:p>
+      <w:pPr>
+        <w:numPr>
+          <w:ilvl w:val="0"/>
+          <w:numId w:val="4"/>
+        </w:numPr>
+        <w:rPr>
+          <w:rFonts w:asciiTheme="majorBidi" w:hAnsiTheme="majorBidi" w:cstheme="majorBidi"/>
+        </w:rPr>
+      </w:pPr>
+      <w:r>
+        <w:rPr>
+          <w:rFonts w:asciiTheme="majorBidi" w:hAnsiTheme="majorBidi" w:cstheme="majorBidi"/>
+        </w:rPr>
+        <w:t>Configured a local Kubernetes cluster using Docker Desktop.</w:t>
+      </w:r>
+    </w:p>
+    <w:p>
+      <w:pPr>
+        <w:numPr>
+          <w:ilvl w:val="0"/>
+          <w:numId w:val="4"/>
+        </w:numPr>
+        <w:rPr>
+          <w:rFonts w:asciiTheme="majorBidi" w:hAnsiTheme="majorBidi" w:cstheme="majorBidi"/>
+        </w:rPr>
+      </w:pPr>
+      <w:r>
+        <w:rPr>
+          <w:rFonts w:asciiTheme="majorBidi" w:hAnsiTheme="majorBidi" w:cstheme="majorBidi"/>
+        </w:rPr>
+        <w:t>Verified the cluster and node status.</w:t>
+      </w:r>
+    </w:p>
+    <w:p>
+      <w:pPr>
+        <w:numPr>
+          <w:ilvl w:val="0"/>
+          <w:numId w:val="4"/>
+        </w:numPr>
+        <w:rPr>
+          <w:rFonts w:asciiTheme="majorBidi" w:hAnsiTheme="majorBidi" w:cstheme="majorBidi"/>
+        </w:rPr>
+      </w:pPr>
+      <w:r>
+        <w:rPr>
+          <w:rFonts w:asciiTheme="majorBidi" w:hAnsiTheme="majorBidi" w:cstheme="majorBidi"/>
+        </w:rPr>
+        <w:t>Tested a sample Nginx deployment.</w:t>
+      </w:r>
+    </w:p>
+    <w:p>
+      <w:pPr>
+        <w:rPr>
+          <w:rFonts w:asciiTheme="majorBidi" w:hAnsiTheme="majorBidi" w:cstheme="majorBidi"/>
+          <w:b/>
+          <w:bCs/>
+        </w:rPr>
+      </w:pPr>
+      <w:r>
+        <w:rPr>
+          <w:rFonts w:asciiTheme="majorBidi" w:hAnsiTheme="majorBidi" w:cstheme="majorBidi"/>
+          <w:b/>
+          <w:bCs/>
+        </w:rPr>
+        <w:drawing>
+          <wp:inline distT="0" distB="0" distL="0" distR="0" wp14:anchorId="2114575A" wp14:editId="23208522">
+            <wp:extent cx="5943600" cy="3142615"/>
+            <wp:effectExtent l="0" t="0" r="0" b="635"/>
+            <wp:docPr id="707422002" name="Picture 1"/>
+            <wp:cNvGraphicFramePr>
+              <a:graphicFrameLocks xmlns:a="http://schemas.openxmlformats.org/drawingml/2006/main" noChangeAspect="1"/>
+            </wp:cNvGraphicFramePr>
+            <a:graphic xmlns:a="http://schemas.openxmlformats.org/drawingml/2006/main">
+              <a:graphicData uri="http://schemas.openxmlformats.org/drawingml/2006/picture">
+                <pic:pic xmlns:pic="http://schemas.openxmlformats.org/drawingml/2006/picture">
+                  <pic:nvPicPr>
+                    <pic:cNvPr id="707422002" name=""/>
+                    <pic:cNvPicPr/>
+                  </pic:nvPicPr>
+                  <pic:blipFill>
+                    <a:blip r:embed="rId8"/>
+                    <a:stretch>
+                      <a:fillRect/>
+                    </a:stretch>
+                  </pic:blipFill>
+                  <pic:spPr>
+                    <a:xfrm>
+                      <a:off x="0" y="0"/>
+                      <a:ext cx="5943600" cy="3142615"/>
+                    </a:xfrm>
+                    <a:prstGeom prst="rect">
+                      <a:avLst/>
+                    </a:prstGeom>
+                  </pic:spPr>
+                </pic:pic>
+              </a:graphicData>
+            </a:graphic>
+          </wp:inline>
+        </w:drawing>
+      </w:r>
+      <w:r>
+        <w:rPr>
+          <w:rFonts w:asciiTheme="majorBidi" w:hAnsiTheme="majorBidi" w:cstheme="majorBidi"/>
+          <w:b/>
+          <w:bCs/>
+        </w:rPr>
+        <w:t>1.5 Apache Kafka</w:t>
+      </w:r>
+    </w:p>
+    <w:p>
+      <w:pPr>
+        <w:numPr>
+          <w:ilvl w:val="0"/>
+          <w:numId w:val="5"/>
+        </w:numPr>
+        <w:rPr>
+          <w:rFonts w:asciiTheme="majorBidi" w:hAnsiTheme="majorBidi" w:cstheme="majorBidi"/>
+        </w:rPr>
+      </w:pPr>
+      <w:r>
+        <w:rPr>
+          <w:rFonts w:asciiTheme="majorBidi" w:hAnsiTheme="majorBidi" w:cstheme="majorBidi"/>
+        </w:rPr>
+        <w:t>Configured Kafka using Docker Compose.</w:t>
+      </w:r>
+    </w:p>
+    <w:p>
+      <w:pPr>
+        <w:numPr>
+          <w:ilvl w:val="0"/>
+          <w:numId w:val="5"/>
+        </w:numPr>
+        <w:rPr>
+          <w:rFonts w:asciiTheme="majorBidi" w:hAnsiTheme="majorBidi" w:cstheme="majorBidi"/>
+        </w:rPr>
+      </w:pPr>
+      <w:r>
+        <w:rPr>
+          <w:rFonts w:asciiTheme="majorBidi" w:hAnsiTheme="majorBidi" w:cstheme="majorBidi"/>
+        </w:rPr>
+        <w:t>Created the midterm-events topic.</w:t>
+      </w:r>
+    </w:p>
+    <w:p>
+      <w:pPr>
+        <w:numPr>
+          <w:ilvl w:val="0"/>
+          <w:numId w:val="5"/>
+        </w:numPr>
+        <w:rPr>
+          <w:rFonts w:asciiTheme="majorBidi" w:hAnsiTheme="majorBidi" w:cstheme="majorBidi"/>
+        </w:rPr>
+      </w:pPr>
+      <w:r>
+        <w:rPr>
+          <w:rFonts w:asciiTheme="majorBidi" w:hAnsiTheme="majorBidi" w:cstheme="majorBidi"/>
+        </w:rPr>
+        <w:t>Tested message publishing and consumption.</w:t>
+      </w:r>
+    </w:p>
+    <w:p>
+      <w:pPr>
+        <w:rPr>
+          <w:rFonts w:asciiTheme="majorBidi" w:hAnsiTheme="majorBidi" w:cstheme="majorBidi"/>
+          <w:b/>
+          <w:bCs/>
+        </w:rPr>
+      </w:pPr>
+      <w:r>
+        <w:rPr>
+          <w:rFonts w:asciiTheme="majorBidi" w:hAnsiTheme="majorBidi" w:cstheme="majorBidi"/>
+          <w:b/>
+          <w:bCs/>
+        </w:rPr>
+        <w:drawing>
+          <wp:inline distT="0" distB="0" distL="0" distR="0" wp14:anchorId="2475C92D" wp14:editId="535CB5D1">
+            <wp:extent cx="5943600" cy="1078865"/>
+            <wp:effectExtent l="0" t="0" r="0" b="6985"/>
+            <wp:docPr id="1278328852" name="Picture 1"/>
+            <wp:cNvGraphicFramePr>
+              <a:graphicFrameLocks xmlns:a="http://schemas.openxmlformats.org/drawingml/2006/main" noChangeAspect="1"/>
+            </wp:cNvGraphicFramePr>
+            <a:graphic xmlns:a="http://schemas.openxmlformats.org/drawingml/2006/main">
+              <a:graphicData uri="http://schemas.openxmlformats.org/drawingml/2006/picture">
+                <pic:pic xmlns:pic="http://schemas.openxmlformats.org/drawingml/2006/picture">
+                  <pic:nvPicPr>
+                    <pic:cNvPr id="1278328852" name=""/>
+                    <pic:cNvPicPr/>
+                  </pic:nvPicPr>
+                  <pic:blipFill>
+                    <a:blip r:embed="rId9"/>
+                    <a:stretch>
+                      <a:fillRect/>
+                    </a:stretch>
+                  </pic:blipFill>
+                  <pic:spPr>
+                    <a:xfrm>
+                      <a:off x="0" y="0"/>
+                      <a:ext cx="5943600" cy="1078865"/>
+                    </a:xfrm>
+                    <a:prstGeom prst="rect">
+                      <a:avLst/>
+                    </a:prstGeom>
+                  </pic:spPr>
+                </pic:pic>
+              </a:graphicData>
+            </a:graphic>
+          </wp:inline>
+        </w:drawing>
+      </w:r>
+      <w:r>
+        <w:rPr>
+          <w:rFonts w:asciiTheme="majorBidi" w:hAnsiTheme="majorBidi" w:cstheme="majorBidi"/>
+          <w:b/>
+          <w:bCs/>
+        </w:rPr>
+        <w:t>1.6 RabbitMQ</w:t>
+      </w:r>
+    </w:p>
+    <w:p>
+      <w:pPr>
+        <w:numPr>
+          <w:ilvl w:val="0"/>
+          <w:numId w:val="6"/>
+        </w:numPr>
+        <w:rPr>
+          <w:rFonts w:asciiTheme="majorBidi" w:hAnsiTheme="majorBidi" w:cstheme="majorBidi"/>
+        </w:rPr>
+      </w:pPr>
+      <w:r>
+        <w:rPr>
+          <w:rFonts w:asciiTheme="majorBidi" w:hAnsiTheme="majorBidi" w:cstheme="majorBidi"/>
+        </w:rPr>
+        <w:t>Configured RabbitMQ using Docker Compose.</w:t>
+      </w:r>
+    </w:p>
+    <w:p>
+      <w:pPr>
+        <w:numPr>
+          <w:ilvl w:val="0"/>
+          <w:numId w:val="6"/>
+        </w:numPr>
+        <w:rPr>
+          <w:rFonts w:asciiTheme="majorBidi" w:hAnsiTheme="majorBidi" w:cstheme="majorBidi"/>
+        </w:rPr>
+      </w:pPr>
+      <w:r>
+        <w:rPr>
+          <w:rFonts w:asciiTheme="majorBidi" w:hAnsiTheme="majorBidi" w:cstheme="majorBidi"/>
+        </w:rPr>
+        <w:t>Accessed the RabbitMQ Management Dashboard.</w:t>
+      </w:r>
+    </w:p>
+    <w:p>
+      <w:pPr>
+        <w:numPr>
+          <w:ilvl w:val="0"/>
+          <w:numId w:val="6"/>
+        </w:numPr>
+        <w:rPr>
+          <w:rFonts w:asciiTheme="majorBidi" w:hAnsiTheme="majorBidi" w:cstheme="majorBidi"/>
+        </w:rPr>
+      </w:pPr>
+      <w:r>
+        <w:rPr>
+          <w:rFonts w:asciiTheme="majorBidi" w:hAnsiTheme="majorBidi" w:cstheme="majorBidi"/>
+        </w:rPr>
+        <w:t>Created a durable message queue.</w:t>
+      </w:r>
+    </w:p>
+    <w:p>
+      <w:pPr>
+        <w:numPr>
+          <w:ilvl w:val="0"/>
+          <w:numId w:val="6"/>
+        </w:numPr>
+        <w:rPr>
+          <w:rFonts w:asciiTheme="majorBidi" w:hAnsiTheme="majorBidi" w:cstheme="majorBidi"/>
+        </w:rPr>
+      </w:pPr>
+      <w:r>
+        <w:rPr>
+          <w:rFonts w:asciiTheme="majorBidi" w:hAnsiTheme="majorBidi" w:cstheme="majorBidi"/>
+        </w:rPr>
+        <w:t>Tested message publishing and consumption using Python.</w:t>
+      </w:r>
+    </w:p>
+    <w:p>
+      <w:pPr>
+        <w:rPr>
+          <w:rFonts w:asciiTheme="majorBidi" w:hAnsiTheme="majorBidi" w:cstheme="majorBidi"/>
+        </w:rPr>
+      </w:pPr>
+      <w:r>
+        <w:rPr>
+          <w:rFonts w:asciiTheme="majorBidi" w:hAnsiTheme="majorBidi" w:cstheme="majorBidi"/>
+        </w:rPr>
+        <w:lastRenderedPageBreak/>
+        <w:drawing>
+          <wp:inline distT="0" distB="0" distL="0" distR="0" wp14:anchorId="47CE3F18" wp14:editId="25EC3294">
+            <wp:extent cx="5943600" cy="428625"/>
+            <wp:effectExtent l="0" t="0" r="0" b="9525"/>
+            <wp:docPr id="1160906771" name="Picture 1"/>
+            <wp:cNvGraphicFramePr>
+              <a:graphicFrameLocks xmlns:a="http://schemas.openxmlformats.org/drawingml/2006/main" noChangeAspect="1"/>
+            </wp:cNvGraphicFramePr>
+            <a:graphic xmlns:a="http://schemas.openxmlformats.org/drawingml/2006/main">
+              <a:graphicData uri="http://schemas.openxmlformats.org/drawingml/2006/picture">
+                <pic:pic xmlns:pic="http://schemas.openxmlformats.org/drawingml/2006/picture">
+                  <pic:nvPicPr>
+                    <pic:cNvPr id="1160906771" name=""/>
+                    <pic:cNvPicPr/>
+                  </pic:nvPicPr>
+                  <pic:blipFill>
+                    <a:blip r:embed="rId10"/>
+                    <a:stretch>
+                      <a:fillRect/>
+                    </a:stretch>
+                  </pic:blipFill>
+                  <pic:spPr>
+                    <a:xfrm>
+                      <a:off x="0" y="0"/>
+                      <a:ext cx="5943600" cy="428625"/>
+                    </a:xfrm>
+                    <a:prstGeom prst="rect">
+                      <a:avLst/>
+                    </a:prstGeom>
+                  </pic:spPr>
+                </pic:pic>
+              </a:graphicData>
+            </a:graphic>
+          </wp:inline>
+        </w:drawing>
+      </w:r>
+    </w:p>
+    <w:p>
+      <w:pPr>
+        <w:rPr>
+          <w:rFonts w:asciiTheme="majorBidi" w:hAnsiTheme="majorBidi" w:cstheme="majorBidi"/>
+        </w:rPr>
+      </w:pPr>
+      <w:r>
+        <w:rPr>
+          <w:rFonts w:asciiTheme="majorBidi" w:hAnsiTheme="majorBidi" w:cstheme="majorBidi"/>
+        </w:rPr>
+        <w:drawing>
+          <wp:inline distT="0" distB="0" distL="0" distR="0" wp14:anchorId="383A4AAC" wp14:editId="23C55DB7">
+            <wp:extent cx="5943600" cy="2194560"/>
+            <wp:effectExtent l="0" t="0" r="0" b="0"/>
+            <wp:docPr id="1974577246" name="Picture 1"/>
+            <wp:cNvGraphicFramePr>
+              <a:graphicFrameLocks xmlns:a="http://schemas.openxmlformats.org/drawingml/2006/main" noChangeAspect="1"/>
+            </wp:cNvGraphicFramePr>
+            <a:graphic xmlns:a="http://schemas.openxmlformats.org/drawingml/2006/main">
+              <a:graphicData uri="http://schemas.openxmlformats.org/drawingml/2006/picture">
+                <pic:pic xmlns:pic="http://schemas.openxmlformats.org/drawingml/2006/picture">
+                  <pic:nvPicPr>
+                    <pic:cNvPr id="1974577246" name=""/>
+                    <pic:cNvPicPr/>
+                  </pic:nvPicPr>
+                  <pic:blipFill>
+                    <a:blip r:embed="rId11"/>
+                    <a:stretch>
+                      <a:fillRect/>
+                    </a:stretch>
+                  </pic:blipFill>
+                  <pic:spPr>
+                    <a:xfrm>
+                      <a:off x="0" y="0"/>
+                      <a:ext cx="5943600" cy="2194560"/>
+                    </a:xfrm>
+                    <a:prstGeom prst="rect">
+                      <a:avLst/>
+                    </a:prstGeom>
+                  </pic:spPr>
+                </pic:pic>
+              </a:graphicData>
+            </a:graphic>
+          </wp:inline>
+        </w:drawing>
+      </w:r>
+    </w:p>
+    <w:p>
+      <w:pPr>
+        <w:rPr>
+          <w:rFonts w:asciiTheme="majorBidi" w:hAnsiTheme="majorBidi" w:cstheme="majorBidi"/>
+          <w:b/>
+          <w:bCs/>
+        </w:rPr>
+      </w:pPr>
+      <w:r>
+        <w:rPr>
+          <w:rFonts w:asciiTheme="majorBidi" w:hAnsiTheme="majorBidi" w:cstheme="majorBidi"/>
+          <w:b/>
+          <w:bCs/>
+        </w:rPr>
+        <w:t>1.7 Prometheus</w:t>
+      </w:r>
+    </w:p>
+    <w:p>
+      <w:pPr>
+        <w:numPr>
+          <w:ilvl w:val="0"/>
+          <w:numId w:val="7"/>
+        </w:numPr>
+        <w:rPr>
+          <w:rFonts w:asciiTheme="majorBidi" w:hAnsiTheme="majorBidi" w:cstheme="majorBidi"/>
+        </w:rPr>
+      </w:pPr>
+      <w:r>
+        <w:rPr>
+          <w:rFonts w:asciiTheme="majorBidi" w:hAnsiTheme="majorBidi" w:cstheme="majorBidi"/>
+        </w:rPr>
+        <w:t>Configured Prometheus using Docker Compose.</w:t>
+      </w:r>
+    </w:p>
+    <w:p>
+      <w:pPr>
+        <w:numPr>
+          <w:ilvl w:val="0"/>
+          <w:numId w:val="7"/>
+        </w:numPr>
+        <w:rPr>
+          <w:rFonts w:asciiTheme="majorBidi" w:hAnsiTheme="majorBidi" w:cstheme="majorBidi"/>
+        </w:rPr>
+      </w:pPr>
+      <w:r>
+        <w:rPr>
+          <w:rFonts w:asciiTheme="majorBidi" w:hAnsiTheme="majorBidi" w:cstheme="majorBidi"/>
+        </w:rPr>
+        <w:t>Connected Prometheus to the Flask application's /metrics endpoint.</w:t>
+      </w:r>
+    </w:p>
+    <w:p>
+      <w:pPr>
+        <w:numPr>
+          <w:ilvl w:val="0"/>
+          <w:numId w:val="7"/>
+        </w:numPr>
+        <w:rPr>
+          <w:rFonts w:asciiTheme="majorBidi" w:hAnsiTheme="majorBidi" w:cstheme="majorBidi"/>
+        </w:rPr>
+      </w:pPr>
+      <w:r>
+        <w:rPr>
+          <w:rFonts w:asciiTheme="majorBidi" w:hAnsiTheme="majorBidi" w:cstheme="majorBidi"/>
+        </w:rPr>
+        <w:t>Verified that Prometheus collects application metrics.</w:t>
+      </w:r>
+    </w:p>
+    <w:p>
+      <w:pPr>
+        <w:rPr>
+          <w:rFonts w:asciiTheme="majorBidi" w:hAnsiTheme="majorBidi" w:cstheme="majorBidi"/>
+          <w:b/>
+          <w:bCs/>
+        </w:rPr>
+      </w:pPr>
+      <w:r>
+        <w:rPr>
+          <w:rFonts w:asciiTheme="majorBidi" w:hAnsiTheme="majorBidi" w:cstheme="majorBidi"/>
+          <w:b/>
+          <w:bCs/>
+        </w:rPr>
+        <w:drawing>
+          <wp:inline distT="0" distB="0" distL="0" distR="0" wp14:anchorId="52842408" wp14:editId="761DCB72">
+            <wp:extent cx="5943600" cy="2829560"/>
+            <wp:effectExtent l="0" t="0" r="0" b="8890"/>
+            <wp:docPr id="1311776352" name="Picture 1"/>
+            <wp:cNvGraphicFramePr>
+              <a:graphicFrameLocks xmlns:a="http://schemas.openxmlformats.org/drawingml/2006/main" noChangeAspect="1"/>
+            </wp:cNvGraphicFramePr>
+            <a:graphic xmlns:a="http://schemas.openxmlformats.org/drawingml/2006/main">
+              <a:graphicData uri="http://schemas.openxmlformats.org/drawingml/2006/picture">
+                <pic:pic xmlns:pic="http://schemas.openxmlformats.org/drawingml/2006/picture">
+                  <pic:nvPicPr>
+                    <pic:cNvPr id="1311776352" name=""/>
+                    <pic:cNvPicPr/>
+                  </pic:nvPicPr>
+                  <pic:blipFill>
+                    <a:blip r:embed="rId12"/>
+                    <a:stretch>
+                      <a:fillRect/>
+                    </a:stretch>
+                  </pic:blipFill>
+                  <pic:spPr>
+                    <a:xfrm>
+                      <a:off x="0" y="0"/>
+                      <a:ext cx="5943600" cy="2829560"/>
+                    </a:xfrm>
+                    <a:prstGeom prst="rect">
+                      <a:avLst/>
+                    </a:prstGeom>
+                  </pic:spPr>
+                </pic:pic>
+              </a:graphicData>
+            </a:graphic>
+          </wp:inline>
+        </w:drawing>
+      </w:r>
+      <w:r>
+        <w:rPr>
+          <w:rFonts w:asciiTheme="majorBidi" w:hAnsiTheme="majorBidi" w:cstheme="majorBidi"/>
+          <w:b/>
+          <w:bCs/>
+        </w:rPr>
+        <w:t>1.8 Grafana</w:t>
+      </w:r>
+    </w:p>
+    <w:p>
+      <w:pPr>
+        <w:numPr>
+          <w:ilvl w:val="0"/>
+          <w:numId w:val="8"/>
+        </w:numPr>
+        <w:rPr>
+          <w:rFonts w:asciiTheme="majorBidi" w:hAnsiTheme="majorBidi" w:cstheme="majorBidi"/>
+        </w:rPr>
+      </w:pPr>
+      <w:r>
+        <w:rPr>
+          <w:rFonts w:asciiTheme="majorBidi" w:hAnsiTheme="majorBidi" w:cstheme="majorBidi"/>
+        </w:rPr>
+        <w:t>Configured Grafana using Docker Compose.</w:t>
+      </w:r>
+    </w:p>
+    <w:p>
+      <w:pPr>
+        <w:numPr>
+          <w:ilvl w:val="0"/>
+          <w:numId w:val="8"/>
+        </w:numPr>
+        <w:rPr>
+          <w:rFonts w:asciiTheme="majorBidi" w:hAnsiTheme="majorBidi" w:cstheme="majorBidi"/>
+        </w:rPr>
+      </w:pPr>
+      <w:r>
+        <w:rPr>
+          <w:rFonts w:asciiTheme="majorBidi" w:hAnsiTheme="majorBidi" w:cstheme="majorBidi"/>
+        </w:rPr>
+        <w:t>Connected Grafana to Prometheus.</w:t>
+      </w:r>
+    </w:p>
+    <w:p>
+      <w:pPr>
+        <w:numPr>
+          <w:ilvl w:val="0"/>
+          <w:numId w:val="8"/>
+        </w:numPr>
+        <w:rPr>
+          <w:rFonts w:asciiTheme="majorBidi" w:hAnsiTheme="majorBidi" w:cstheme="majorBidi"/>
+        </w:rPr>
+      </w:pPr>
+      <w:r>
+        <w:rPr>
+          <w:rFonts w:asciiTheme="majorBidi" w:hAnsiTheme="majorBidi" w:cstheme="majorBidi"/>
+        </w:rPr>
+        <w:t xml:space="preserve">Created a visualization using the </w:t>
+      </w:r>
+      <w:proofErr w:type="spellStart"/>
+      <w:r>
+        <w:rPr>
+          <w:rFonts w:asciiTheme="majorBidi" w:hAnsiTheme="majorBidi" w:cstheme="majorBidi"/>
+        </w:rPr>
+        <w:t>midterm_requests_total</w:t>
+      </w:r>
+      <w:proofErr w:type="spellEnd"/>
+      <w:r>
+        <w:rPr>
+          <w:rFonts w:asciiTheme="majorBidi" w:hAnsiTheme="majorBidi" w:cstheme="majorBidi"/>
+        </w:rPr>
+        <w:t xml:space="preserve"> metric.</w:t>
+      </w:r>
+    </w:p>
+    <w:p>
+      <w:pPr>
+        <w:rPr>
+          <w:rFonts w:asciiTheme="majorBidi" w:hAnsiTheme="majorBidi" w:cstheme="majorBidi"/>
+          <w:b/>
+          <w:bCs/>
+        </w:rPr>
+      </w:pPr>
+      <w:r>
+        <w:rPr>
+          <w:rFonts w:asciiTheme="majorBidi" w:hAnsiTheme="majorBidi" w:cstheme="majorBidi"/>
+          <w:b/>
+          <w:bCs/>
+        </w:rPr>
+        <w:lastRenderedPageBreak/>
+        <w:drawing>
+          <wp:inline distT="0" distB="0" distL="0" distR="0" wp14:anchorId="34CB9CC5" wp14:editId="12B8D102">
+            <wp:extent cx="5943600" cy="2814320"/>
+            <wp:effectExtent l="0" t="0" r="0" b="5080"/>
+            <wp:docPr id="676303361" name="Picture 1"/>
+            <wp:cNvGraphicFramePr>
+              <a:graphicFrameLocks xmlns:a="http://schemas.openxmlformats.org/drawingml/2006/main" noChangeAspect="1"/>
+            </wp:cNvGraphicFramePr>
+            <a:graphic xmlns:a="http://schemas.openxmlformats.org/drawingml/2006/main">
+              <a:graphicData uri="http://schemas.openxmlformats.org/drawingml/2006/picture">
+                <pic:pic xmlns:pic="http://schemas.openxmlformats.org/drawingml/2006/picture">
+                  <pic:nvPicPr>
+                    <pic:cNvPr id="676303361" name=""/>
+                    <pic:cNvPicPr/>
+                  </pic:nvPicPr>
+                  <pic:blipFill>
+                    <a:blip r:embed="rId13"/>
+                    <a:stretch>
+                      <a:fillRect/>
+                    </a:stretch>
+                  </pic:blipFill>
+                  <pic:spPr>
+                    <a:xfrm>
+                      <a:off x="0" y="0"/>
+                      <a:ext cx="5943600" cy="2814320"/>
+                    </a:xfrm>
+                    <a:prstGeom prst="rect">
+                      <a:avLst/>
+                    </a:prstGeom>
+                  </pic:spPr>
+                </pic:pic>
+              </a:graphicData>
+            </a:graphic>
+          </wp:inline>
+        </w:drawing>
+      </w:r>
+      <w:r>
+        <w:rPr>
+          <w:rFonts w:asciiTheme="majorBidi" w:hAnsiTheme="majorBidi" w:cstheme="majorBidi"/>
+          <w:b/>
+          <w:bCs/>
+        </w:rPr>
+        <w:t>2</w:t>
+      </w:r>
+      <w:r>
+        <w:rPr>
+          <w:rFonts w:asciiTheme="majorBidi" w:hAnsiTheme="majorBidi" w:cstheme="majorBidi"/>
+          <w:b/>
+          <w:bCs/>
+        </w:rPr>
+        <w:t>. Midterm Implementation</w:t>
+      </w:r>
+    </w:p>
+    <w:p>
+      <w:pPr>
+        <w:rPr>
+          <w:rFonts w:asciiTheme="majorBidi" w:hAnsiTheme="majorBidi" w:cstheme="majorBidi"/>
+        </w:rPr>
+      </w:pPr>
+      <w:r>
+        <w:rPr>
+          <w:rFonts w:asciiTheme="majorBidi" w:hAnsiTheme="majorBidi" w:cstheme="majorBidi"/>
+        </w:rPr>
+        <w:t>The development environment has been prepared for the midterm project.</w:t>
+      </w:r>
+    </w:p>
+    <w:p>
+      <w:pPr>
+        <w:rPr>
+          <w:rFonts w:asciiTheme="majorBidi" w:hAnsiTheme="majorBidi" w:cstheme="majorBidi"/>
+        </w:rPr>
+      </w:pPr>
+      <w:r>
+        <w:rPr>
+          <w:rFonts w:asciiTheme="majorBidi" w:hAnsiTheme="majorBidi" w:cstheme="majorBidi"/>
+        </w:rPr>
+        <w:t>The next phase will include:</w:t>
+      </w:r>
+    </w:p>
+    <w:p>
+      <w:pPr>
+        <w:numPr>
+          <w:ilvl w:val="0"/>
+          <w:numId w:val="9"/>
+        </w:numPr>
+        <w:rPr>
+          <w:rFonts w:asciiTheme="majorBidi" w:hAnsiTheme="majorBidi" w:cstheme="majorBidi"/>
+        </w:rPr>
+      </w:pPr>
+      <w:r>
+        <w:rPr>
+          <w:rFonts w:asciiTheme="majorBidi" w:hAnsiTheme="majorBidi" w:cstheme="majorBidi"/>
+        </w:rPr>
+        <w:t>Implementing the required midterm functionalities.</w:t>
+      </w:r>
+    </w:p>
+    <w:p>
+      <w:pPr>
+        <w:numPr>
+          <w:ilvl w:val="0"/>
+          <w:numId w:val="9"/>
+        </w:numPr>
+        <w:rPr>
+          <w:rFonts w:asciiTheme="majorBidi" w:hAnsiTheme="majorBidi" w:cstheme="majorBidi"/>
+        </w:rPr>
+      </w:pPr>
+      <w:r>
+        <w:rPr>
+          <w:rFonts w:asciiTheme="majorBidi" w:hAnsiTheme="majorBidi" w:cstheme="majorBidi"/>
+        </w:rPr>
+        <w:t>Running and testing the applications.</w:t>
+      </w:r>
+    </w:p>
+    <w:p>
+      <w:pPr>
+        <w:numPr>
+          <w:ilvl w:val="0"/>
+          <w:numId w:val="9"/>
+        </w:numPr>
+        <w:rPr>
+          <w:rFonts w:asciiTheme="majorBidi" w:hAnsiTheme="majorBidi" w:cstheme="majorBidi"/>
+        </w:rPr>
+      </w:pPr>
+      <w:r>
+        <w:rPr>
+          <w:rFonts w:asciiTheme="majorBidi" w:hAnsiTheme="majorBidi" w:cstheme="majorBidi"/>
+        </w:rPr>
+        <w:t>Documenting the implementation steps.</w:t>
+      </w:r>
+    </w:p>
+    <w:p>
+      <w:pPr>
+        <w:numPr>
+          <w:ilvl w:val="0"/>
+          <w:numId w:val="9"/>
+        </w:numPr>
+        <w:rPr>
+          <w:rFonts w:asciiTheme="majorBidi" w:hAnsiTheme="majorBidi" w:cstheme="majorBidi"/>
+        </w:rPr>
+      </w:pPr>
+      <w:r>
+        <w:rPr>
+          <w:rFonts w:asciiTheme="majorBidi" w:hAnsiTheme="majorBidi" w:cstheme="majorBidi"/>
+        </w:rPr>
+        <w:t>Adding screenshots of the results.</w:t>
+      </w:r>
+    </w:p>
+    <w:p>
+      <w:pPr>
+        <w:numPr>
+          <w:ilvl w:val="0"/>
+          <w:numId w:val="9"/>
+        </w:numPr>
+        <w:rPr>
+          <w:rFonts w:asciiTheme="majorBidi" w:hAnsiTheme="majorBidi" w:cstheme="majorBidi"/>
+        </w:rPr>
+      </w:pPr>
+      <w:r>
+        <w:rPr>
+          <w:rFonts w:asciiTheme="majorBidi" w:hAnsiTheme="majorBidi" w:cstheme="majorBidi"/>
+        </w:rPr>
+        <w:t>Recording any errors encountered and their solutions.</w:t>
+      </w:r>
+    </w:p>
+    <w:p>
+      <w:pPr>
+        <w:rPr>
+          <w:rFonts w:asciiTheme="majorBidi" w:hAnsiTheme="majorBidi" w:cstheme="majorBidi"/>
+        </w:rPr>
+      </w:pPr>
+      <w:r>
+        <w:rPr>
+          <w:rFonts w:asciiTheme="majorBidi" w:hAnsiTheme="majorBidi" w:cstheme="majorBidi"/>
+        </w:rPr>
+        <w:t>The implementation details and results will be added as the midterm progresses.</w:t>
+      </w:r>
+    </w:p>
+    <w:p>
+      <w:pPr>
+        <w:rPr>
+          <w:rFonts w:asciiTheme="majorBidi" w:hAnsiTheme="majorBidi" w:cstheme="majorBidi"/>
+        </w:rPr>
+      </w:pPr>
+    </w:p>
     <w:sectPr>
       <w:pgSz w:w="12240" w:h="15840"/>
       <w:pgMar w:top="1440" w:right="1440" w:bottom="1440" w:left="1440" w:header="720" w:footer="720" w:gutter="0"/>
@@ -11,6 +1338,1379 @@
     </w:sectPr>
   </w:body>
 </w:document>
+</file>
+
+<file path=word/numbering.xml><?xml version="1.0" encoding="utf-8"?>
+<w:numbering xmlns:wpc="http://schemas.microsoft.com/office/word/2010/wordprocessingCanvas" xmlns:cx="http://schemas.microsoft.com/office/drawing/2014/chartex" xmlns:cx1="http://schemas.microsoft.com/office/drawing/2015/9/8/chartex" xmlns:cx2="http://schemas.microsoft.com/office/drawing/2015/10/21/chartex" xmlns:cx3="http://schemas.microsoft.com/office/drawing/2016/5/9/chartex" xmlns:cx4="http://schemas.microsoft.com/office/drawing/2016/5/10/chartex" xmlns:cx5="http://schemas.microsoft.com/office/drawing/2016/5/11/chartex" xmlns:cx6="http://schemas.microsoft.com/office/drawing/2016/5/12/chartex" xmlns:cx7="http://schemas.microsoft.com/office/drawing/2016/5/13/chartex" xmlns:cx8="http://schemas.microsoft.com/office/drawing/2016/5/14/chartex" xmlns:mc="http://schemas.openxmlformats.org/markup-compatibility/2006" xmlns:aink="http://schemas.microsoft.com/office/drawing/2016/ink" xmlns:am3d="http://schemas.microsoft.com/office/drawing/2017/model3d" xmlns:o="urn:schemas-microsoft-com:office:office" xmlns:oel="http://schemas.microsoft.com/office/2019/extlst" xmlns:r="http://schemas.openxmlformats.org/officeDocument/2006/relationships" xmlns:m="http://schemas.openxmlformats.org/officeDocument/2006/math" xmlns:v="urn:schemas-microsoft-com:vml" xmlns:wp14="http://schemas.microsoft.com/office/word/2010/wordprocessingDrawing" xmlns:wp="http://schemas.openxmlformats.org/drawingml/2006/wordprocessingDrawing" xmlns:w10="urn:schemas-microsoft-com:office:word" xmlns:w="http://schemas.openxmlformats.org/wordprocessingml/2006/main" xmlns:w14="http://schemas.microsoft.com/office/word/2010/wordml" xmlns:w15="http://schemas.microsoft.com/office/word/2012/wordml" xmlns:w16cex="http://schemas.microsoft.com/office/word/2018/wordml/cex" xmlns:w16cid="http://schemas.microsoft.com/office/word/2016/wordml/cid" xmlns:w16="http://schemas.microsoft.com/office/word/2018/wordml" xmlns:w16du="http://schemas.microsoft.com/office/word/2023/wordml/word16du" xmlns:w16sdtdh="http://schemas.microsoft.com/office/word/2020/wordml/sdtdatahash" xmlns:w16sdtfl="http://schemas.microsoft.com/office/word/2024/wordml/sdtformatlock" xmlns:w16se="http://schemas.microsoft.com/office/word/2015/wordml/symex" xmlns:wpg="http://schemas.microsoft.com/office/word/2010/wordprocessingGroup" xmlns:wpi="http://schemas.microsoft.com/office/word/2010/wordprocessingInk" xmlns:wne="http://schemas.microsoft.com/office/word/2006/wordml" xmlns:wps="http://schemas.microsoft.com/office/word/2010/wordprocessingShape" mc:Ignorable="w14 w15 w16se w16cid w16 w16cex w16sdtdh w16sdtfl w16du wp14">
+  <w:abstractNum w:abstractNumId="0" w15:restartNumberingAfterBreak="0">
+    <w:nsid w:val="087D5A88"/>
+    <w:multiLevelType w:val="multilevel"/>
+    <w:tmpl w:val="A9D6E6C4"/>
+    <w:lvl w:ilvl="0">
+      <w:start w:val="1"/>
+      <w:numFmt w:val="bullet"/>
+      <w:lvlText w:val=""/>
+      <w:lvlJc w:val="left"/>
+      <w:pPr>
+        <w:tabs>
+          <w:tab w:val="num" w:pos="720"/>
+        </w:tabs>
+        <w:ind w:left="720" w:hanging="360"/>
+      </w:pPr>
+      <w:rPr>
+        <w:rFonts w:ascii="Symbol" w:hAnsi="Symbol" w:hint="default"/>
+        <w:sz w:val="20"/>
+      </w:rPr>
+    </w:lvl>
+    <w:lvl w:ilvl="1" w:tentative="1">
+      <w:start w:val="1"/>
+      <w:numFmt w:val="bullet"/>
+      <w:lvlText w:val="o"/>
+      <w:lvlJc w:val="left"/>
+      <w:pPr>
+        <w:tabs>
+          <w:tab w:val="num" w:pos="1440"/>
+        </w:tabs>
+        <w:ind w:left="1440" w:hanging="360"/>
+      </w:pPr>
+      <w:rPr>
+        <w:rFonts w:ascii="Courier New" w:hAnsi="Courier New" w:hint="default"/>
+        <w:sz w:val="20"/>
+      </w:rPr>
+    </w:lvl>
+    <w:lvl w:ilvl="2" w:tentative="1">
+      <w:start w:val="1"/>
+      <w:numFmt w:val="bullet"/>
+      <w:lvlText w:val=""/>
+      <w:lvlJc w:val="left"/>
+      <w:pPr>
+        <w:tabs>
+          <w:tab w:val="num" w:pos="2160"/>
+        </w:tabs>
+        <w:ind w:left="2160" w:hanging="360"/>
+      </w:pPr>
+      <w:rPr>
+        <w:rFonts w:ascii="Wingdings" w:hAnsi="Wingdings" w:hint="default"/>
+        <w:sz w:val="20"/>
+      </w:rPr>
+    </w:lvl>
+    <w:lvl w:ilvl="3" w:tentative="1">
+      <w:start w:val="1"/>
+      <w:numFmt w:val="bullet"/>
+      <w:lvlText w:val=""/>
+      <w:lvlJc w:val="left"/>
+      <w:pPr>
+        <w:tabs>
+          <w:tab w:val="num" w:pos="2880"/>
+        </w:tabs>
+        <w:ind w:left="2880" w:hanging="360"/>
+      </w:pPr>
+      <w:rPr>
+        <w:rFonts w:ascii="Wingdings" w:hAnsi="Wingdings" w:hint="default"/>
+        <w:sz w:val="20"/>
+      </w:rPr>
+    </w:lvl>
+    <w:lvl w:ilvl="4" w:tentative="1">
+      <w:start w:val="1"/>
+      <w:numFmt w:val="bullet"/>
+      <w:lvlText w:val=""/>
+      <w:lvlJc w:val="left"/>
+      <w:pPr>
+        <w:tabs>
+          <w:tab w:val="num" w:pos="3600"/>
+        </w:tabs>
+        <w:ind w:left="3600" w:hanging="360"/>
+      </w:pPr>
+      <w:rPr>
+        <w:rFonts w:ascii="Wingdings" w:hAnsi="Wingdings" w:hint="default"/>
+        <w:sz w:val="20"/>
+      </w:rPr>
+    </w:lvl>
+    <w:lvl w:ilvl="5" w:tentative="1">
+      <w:start w:val="1"/>
+      <w:numFmt w:val="bullet"/>
+      <w:lvlText w:val=""/>
+      <w:lvlJc w:val="left"/>
+      <w:pPr>
+        <w:tabs>
+          <w:tab w:val="num" w:pos="4320"/>
+        </w:tabs>
+        <w:ind w:left="4320" w:hanging="360"/>
+      </w:pPr>
+      <w:rPr>
+        <w:rFonts w:ascii="Wingdings" w:hAnsi="Wingdings" w:hint="default"/>
+        <w:sz w:val="20"/>
+      </w:rPr>
+    </w:lvl>
+    <w:lvl w:ilvl="6" w:tentative="1">
+      <w:start w:val="1"/>
+      <w:numFmt w:val="bullet"/>
+      <w:lvlText w:val=""/>
+      <w:lvlJc w:val="left"/>
+      <w:pPr>
+        <w:tabs>
+          <w:tab w:val="num" w:pos="5040"/>
+        </w:tabs>
+        <w:ind w:left="5040" w:hanging="360"/>
+      </w:pPr>
+      <w:rPr>
+        <w:rFonts w:ascii="Wingdings" w:hAnsi="Wingdings" w:hint="default"/>
+        <w:sz w:val="20"/>
+      </w:rPr>
+    </w:lvl>
+    <w:lvl w:ilvl="7" w:tentative="1">
+      <w:start w:val="1"/>
+      <w:numFmt w:val="bullet"/>
+      <w:lvlText w:val=""/>
+      <w:lvlJc w:val="left"/>
+      <w:pPr>
+        <w:tabs>
+          <w:tab w:val="num" w:pos="5760"/>
+        </w:tabs>
+        <w:ind w:left="5760" w:hanging="360"/>
+      </w:pPr>
+      <w:rPr>
+        <w:rFonts w:ascii="Wingdings" w:hAnsi="Wingdings" w:hint="default"/>
+        <w:sz w:val="20"/>
+      </w:rPr>
+    </w:lvl>
+    <w:lvl w:ilvl="8" w:tentative="1">
+      <w:start w:val="1"/>
+      <w:numFmt w:val="bullet"/>
+      <w:lvlText w:val=""/>
+      <w:lvlJc w:val="left"/>
+      <w:pPr>
+        <w:tabs>
+          <w:tab w:val="num" w:pos="6480"/>
+        </w:tabs>
+        <w:ind w:left="6480" w:hanging="360"/>
+      </w:pPr>
+      <w:rPr>
+        <w:rFonts w:ascii="Wingdings" w:hAnsi="Wingdings" w:hint="default"/>
+        <w:sz w:val="20"/>
+      </w:rPr>
+    </w:lvl>
+  </w:abstractNum>
+  <w:abstractNum w:abstractNumId="1" w15:restartNumberingAfterBreak="0">
+    <w:nsid w:val="361F0C20"/>
+    <w:multiLevelType w:val="multilevel"/>
+    <w:tmpl w:val="C6986B98"/>
+    <w:lvl w:ilvl="0">
+      <w:start w:val="1"/>
+      <w:numFmt w:val="bullet"/>
+      <w:lvlText w:val=""/>
+      <w:lvlJc w:val="left"/>
+      <w:pPr>
+        <w:tabs>
+          <w:tab w:val="num" w:pos="720"/>
+        </w:tabs>
+        <w:ind w:left="720" w:hanging="360"/>
+      </w:pPr>
+      <w:rPr>
+        <w:rFonts w:ascii="Symbol" w:hAnsi="Symbol" w:hint="default"/>
+        <w:sz w:val="20"/>
+      </w:rPr>
+    </w:lvl>
+    <w:lvl w:ilvl="1" w:tentative="1">
+      <w:start w:val="1"/>
+      <w:numFmt w:val="bullet"/>
+      <w:lvlText w:val="o"/>
+      <w:lvlJc w:val="left"/>
+      <w:pPr>
+        <w:tabs>
+          <w:tab w:val="num" w:pos="1440"/>
+        </w:tabs>
+        <w:ind w:left="1440" w:hanging="360"/>
+      </w:pPr>
+      <w:rPr>
+        <w:rFonts w:ascii="Courier New" w:hAnsi="Courier New" w:hint="default"/>
+        <w:sz w:val="20"/>
+      </w:rPr>
+    </w:lvl>
+    <w:lvl w:ilvl="2" w:tentative="1">
+      <w:start w:val="1"/>
+      <w:numFmt w:val="bullet"/>
+      <w:lvlText w:val=""/>
+      <w:lvlJc w:val="left"/>
+      <w:pPr>
+        <w:tabs>
+          <w:tab w:val="num" w:pos="2160"/>
+        </w:tabs>
+        <w:ind w:left="2160" w:hanging="360"/>
+      </w:pPr>
+      <w:rPr>
+        <w:rFonts w:ascii="Wingdings" w:hAnsi="Wingdings" w:hint="default"/>
+        <w:sz w:val="20"/>
+      </w:rPr>
+    </w:lvl>
+    <w:lvl w:ilvl="3" w:tentative="1">
+      <w:start w:val="1"/>
+      <w:numFmt w:val="bullet"/>
+      <w:lvlText w:val=""/>
+      <w:lvlJc w:val="left"/>
+      <w:pPr>
+        <w:tabs>
+          <w:tab w:val="num" w:pos="2880"/>
+        </w:tabs>
+        <w:ind w:left="2880" w:hanging="360"/>
+      </w:pPr>
+      <w:rPr>
+        <w:rFonts w:ascii="Wingdings" w:hAnsi="Wingdings" w:hint="default"/>
+        <w:sz w:val="20"/>
+      </w:rPr>
+    </w:lvl>
+    <w:lvl w:ilvl="4" w:tentative="1">
+      <w:start w:val="1"/>
+      <w:numFmt w:val="bullet"/>
+      <w:lvlText w:val=""/>
+      <w:lvlJc w:val="left"/>
+      <w:pPr>
+        <w:tabs>
+          <w:tab w:val="num" w:pos="3600"/>
+        </w:tabs>
+        <w:ind w:left="3600" w:hanging="360"/>
+      </w:pPr>
+      <w:rPr>
+        <w:rFonts w:ascii="Wingdings" w:hAnsi="Wingdings" w:hint="default"/>
+        <w:sz w:val="20"/>
+      </w:rPr>
+    </w:lvl>
+    <w:lvl w:ilvl="5" w:tentative="1">
+      <w:start w:val="1"/>
+      <w:numFmt w:val="bullet"/>
+      <w:lvlText w:val=""/>
+      <w:lvlJc w:val="left"/>
+      <w:pPr>
+        <w:tabs>
+          <w:tab w:val="num" w:pos="4320"/>
+        </w:tabs>
+        <w:ind w:left="4320" w:hanging="360"/>
+      </w:pPr>
+      <w:rPr>
+        <w:rFonts w:ascii="Wingdings" w:hAnsi="Wingdings" w:hint="default"/>
+        <w:sz w:val="20"/>
+      </w:rPr>
+    </w:lvl>
+    <w:lvl w:ilvl="6" w:tentative="1">
+      <w:start w:val="1"/>
+      <w:numFmt w:val="bullet"/>
+      <w:lvlText w:val=""/>
+      <w:lvlJc w:val="left"/>
+      <w:pPr>
+        <w:tabs>
+          <w:tab w:val="num" w:pos="5040"/>
+        </w:tabs>
+        <w:ind w:left="5040" w:hanging="360"/>
+      </w:pPr>
+      <w:rPr>
+        <w:rFonts w:ascii="Wingdings" w:hAnsi="Wingdings" w:hint="default"/>
+        <w:sz w:val="20"/>
+      </w:rPr>
+    </w:lvl>
+    <w:lvl w:ilvl="7" w:tentative="1">
+      <w:start w:val="1"/>
+      <w:numFmt w:val="bullet"/>
+      <w:lvlText w:val=""/>
+      <w:lvlJc w:val="left"/>
+      <w:pPr>
+        <w:tabs>
+          <w:tab w:val="num" w:pos="5760"/>
+        </w:tabs>
+        <w:ind w:left="5760" w:hanging="360"/>
+      </w:pPr>
+      <w:rPr>
+        <w:rFonts w:ascii="Wingdings" w:hAnsi="Wingdings" w:hint="default"/>
+        <w:sz w:val="20"/>
+      </w:rPr>
+    </w:lvl>
+    <w:lvl w:ilvl="8" w:tentative="1">
+      <w:start w:val="1"/>
+      <w:numFmt w:val="bullet"/>
+      <w:lvlText w:val=""/>
+      <w:lvlJc w:val="left"/>
+      <w:pPr>
+        <w:tabs>
+          <w:tab w:val="num" w:pos="6480"/>
+        </w:tabs>
+        <w:ind w:left="6480" w:hanging="360"/>
+      </w:pPr>
+      <w:rPr>
+        <w:rFonts w:ascii="Wingdings" w:hAnsi="Wingdings" w:hint="default"/>
+        <w:sz w:val="20"/>
+      </w:rPr>
+    </w:lvl>
+  </w:abstractNum>
+  <w:abstractNum w:abstractNumId="2" w15:restartNumberingAfterBreak="0">
+    <w:nsid w:val="38D7409B"/>
+    <w:multiLevelType w:val="multilevel"/>
+    <w:tmpl w:val="9C6A108C"/>
+    <w:lvl w:ilvl="0">
+      <w:start w:val="1"/>
+      <w:numFmt w:val="bullet"/>
+      <w:lvlText w:val=""/>
+      <w:lvlJc w:val="left"/>
+      <w:pPr>
+        <w:tabs>
+          <w:tab w:val="num" w:pos="720"/>
+        </w:tabs>
+        <w:ind w:left="720" w:hanging="360"/>
+      </w:pPr>
+      <w:rPr>
+        <w:rFonts w:ascii="Symbol" w:hAnsi="Symbol" w:hint="default"/>
+        <w:sz w:val="20"/>
+      </w:rPr>
+    </w:lvl>
+    <w:lvl w:ilvl="1" w:tentative="1">
+      <w:start w:val="1"/>
+      <w:numFmt w:val="bullet"/>
+      <w:lvlText w:val="o"/>
+      <w:lvlJc w:val="left"/>
+      <w:pPr>
+        <w:tabs>
+          <w:tab w:val="num" w:pos="1440"/>
+        </w:tabs>
+        <w:ind w:left="1440" w:hanging="360"/>
+      </w:pPr>
+      <w:rPr>
+        <w:rFonts w:ascii="Courier New" w:hAnsi="Courier New" w:hint="default"/>
+        <w:sz w:val="20"/>
+      </w:rPr>
+    </w:lvl>
+    <w:lvl w:ilvl="2" w:tentative="1">
+      <w:start w:val="1"/>
+      <w:numFmt w:val="bullet"/>
+      <w:lvlText w:val=""/>
+      <w:lvlJc w:val="left"/>
+      <w:pPr>
+        <w:tabs>
+          <w:tab w:val="num" w:pos="2160"/>
+        </w:tabs>
+        <w:ind w:left="2160" w:hanging="360"/>
+      </w:pPr>
+      <w:rPr>
+        <w:rFonts w:ascii="Wingdings" w:hAnsi="Wingdings" w:hint="default"/>
+        <w:sz w:val="20"/>
+      </w:rPr>
+    </w:lvl>
+    <w:lvl w:ilvl="3" w:tentative="1">
+      <w:start w:val="1"/>
+      <w:numFmt w:val="bullet"/>
+      <w:lvlText w:val=""/>
+      <w:lvlJc w:val="left"/>
+      <w:pPr>
+        <w:tabs>
+          <w:tab w:val="num" w:pos="2880"/>
+        </w:tabs>
+        <w:ind w:left="2880" w:hanging="360"/>
+      </w:pPr>
+      <w:rPr>
+        <w:rFonts w:ascii="Wingdings" w:hAnsi="Wingdings" w:hint="default"/>
+        <w:sz w:val="20"/>
+      </w:rPr>
+    </w:lvl>
+    <w:lvl w:ilvl="4" w:tentative="1">
+      <w:start w:val="1"/>
+      <w:numFmt w:val="bullet"/>
+      <w:lvlText w:val=""/>
+      <w:lvlJc w:val="left"/>
+      <w:pPr>
+        <w:tabs>
+          <w:tab w:val="num" w:pos="3600"/>
+        </w:tabs>
+        <w:ind w:left="3600" w:hanging="360"/>
+      </w:pPr>
+      <w:rPr>
+        <w:rFonts w:ascii="Wingdings" w:hAnsi="Wingdings" w:hint="default"/>
+        <w:sz w:val="20"/>
+      </w:rPr>
+    </w:lvl>
+    <w:lvl w:ilvl="5" w:tentative="1">
+      <w:start w:val="1"/>
+      <w:numFmt w:val="bullet"/>
+      <w:lvlText w:val=""/>
+      <w:lvlJc w:val="left"/>
+      <w:pPr>
+        <w:tabs>
+          <w:tab w:val="num" w:pos="4320"/>
+        </w:tabs>
+        <w:ind w:left="4320" w:hanging="360"/>
+      </w:pPr>
+      <w:rPr>
+        <w:rFonts w:ascii="Wingdings" w:hAnsi="Wingdings" w:hint="default"/>
+        <w:sz w:val="20"/>
+      </w:rPr>
+    </w:lvl>
+    <w:lvl w:ilvl="6" w:tentative="1">
+      <w:start w:val="1"/>
+      <w:numFmt w:val="bullet"/>
+      <w:lvlText w:val=""/>
+      <w:lvlJc w:val="left"/>
+      <w:pPr>
+        <w:tabs>
+          <w:tab w:val="num" w:pos="5040"/>
+        </w:tabs>
+        <w:ind w:left="5040" w:hanging="360"/>
+      </w:pPr>
+      <w:rPr>
+        <w:rFonts w:ascii="Wingdings" w:hAnsi="Wingdings" w:hint="default"/>
+        <w:sz w:val="20"/>
+      </w:rPr>
+    </w:lvl>
+    <w:lvl w:ilvl="7" w:tentative="1">
+      <w:start w:val="1"/>
+      <w:numFmt w:val="bullet"/>
+      <w:lvlText w:val=""/>
+      <w:lvlJc w:val="left"/>
+      <w:pPr>
+        <w:tabs>
+          <w:tab w:val="num" w:pos="5760"/>
+        </w:tabs>
+        <w:ind w:left="5760" w:hanging="360"/>
+      </w:pPr>
+      <w:rPr>
+        <w:rFonts w:ascii="Wingdings" w:hAnsi="Wingdings" w:hint="default"/>
+        <w:sz w:val="20"/>
+      </w:rPr>
+    </w:lvl>
+    <w:lvl w:ilvl="8" w:tentative="1">
+      <w:start w:val="1"/>
+      <w:numFmt w:val="bullet"/>
+      <w:lvlText w:val=""/>
+      <w:lvlJc w:val="left"/>
+      <w:pPr>
+        <w:tabs>
+          <w:tab w:val="num" w:pos="6480"/>
+        </w:tabs>
+        <w:ind w:left="6480" w:hanging="360"/>
+      </w:pPr>
+      <w:rPr>
+        <w:rFonts w:ascii="Wingdings" w:hAnsi="Wingdings" w:hint="default"/>
+        <w:sz w:val="20"/>
+      </w:rPr>
+    </w:lvl>
+  </w:abstractNum>
+  <w:abstractNum w:abstractNumId="3" w15:restartNumberingAfterBreak="0">
+    <w:nsid w:val="42D64A08"/>
+    <w:multiLevelType w:val="multilevel"/>
+    <w:tmpl w:val="BF9E8A18"/>
+    <w:lvl w:ilvl="0">
+      <w:start w:val="1"/>
+      <w:numFmt w:val="bullet"/>
+      <w:lvlText w:val=""/>
+      <w:lvlJc w:val="left"/>
+      <w:pPr>
+        <w:tabs>
+          <w:tab w:val="num" w:pos="720"/>
+        </w:tabs>
+        <w:ind w:left="720" w:hanging="360"/>
+      </w:pPr>
+      <w:rPr>
+        <w:rFonts w:ascii="Symbol" w:hAnsi="Symbol" w:hint="default"/>
+        <w:sz w:val="20"/>
+      </w:rPr>
+    </w:lvl>
+    <w:lvl w:ilvl="1" w:tentative="1">
+      <w:start w:val="1"/>
+      <w:numFmt w:val="bullet"/>
+      <w:lvlText w:val="o"/>
+      <w:lvlJc w:val="left"/>
+      <w:pPr>
+        <w:tabs>
+          <w:tab w:val="num" w:pos="1440"/>
+        </w:tabs>
+        <w:ind w:left="1440" w:hanging="360"/>
+      </w:pPr>
+      <w:rPr>
+        <w:rFonts w:ascii="Courier New" w:hAnsi="Courier New" w:hint="default"/>
+        <w:sz w:val="20"/>
+      </w:rPr>
+    </w:lvl>
+    <w:lvl w:ilvl="2" w:tentative="1">
+      <w:start w:val="1"/>
+      <w:numFmt w:val="bullet"/>
+      <w:lvlText w:val=""/>
+      <w:lvlJc w:val="left"/>
+      <w:pPr>
+        <w:tabs>
+          <w:tab w:val="num" w:pos="2160"/>
+        </w:tabs>
+        <w:ind w:left="2160" w:hanging="360"/>
+      </w:pPr>
+      <w:rPr>
+        <w:rFonts w:ascii="Wingdings" w:hAnsi="Wingdings" w:hint="default"/>
+        <w:sz w:val="20"/>
+      </w:rPr>
+    </w:lvl>
+    <w:lvl w:ilvl="3" w:tentative="1">
+      <w:start w:val="1"/>
+      <w:numFmt w:val="bullet"/>
+      <w:lvlText w:val=""/>
+      <w:lvlJc w:val="left"/>
+      <w:pPr>
+        <w:tabs>
+          <w:tab w:val="num" w:pos="2880"/>
+        </w:tabs>
+        <w:ind w:left="2880" w:hanging="360"/>
+      </w:pPr>
+      <w:rPr>
+        <w:rFonts w:ascii="Wingdings" w:hAnsi="Wingdings" w:hint="default"/>
+        <w:sz w:val="20"/>
+      </w:rPr>
+    </w:lvl>
+    <w:lvl w:ilvl="4" w:tentative="1">
+      <w:start w:val="1"/>
+      <w:numFmt w:val="bullet"/>
+      <w:lvlText w:val=""/>
+      <w:lvlJc w:val="left"/>
+      <w:pPr>
+        <w:tabs>
+          <w:tab w:val="num" w:pos="3600"/>
+        </w:tabs>
+        <w:ind w:left="3600" w:hanging="360"/>
+      </w:pPr>
+      <w:rPr>
+        <w:rFonts w:ascii="Wingdings" w:hAnsi="Wingdings" w:hint="default"/>
+        <w:sz w:val="20"/>
+      </w:rPr>
+    </w:lvl>
+    <w:lvl w:ilvl="5" w:tentative="1">
+      <w:start w:val="1"/>
+      <w:numFmt w:val="bullet"/>
+      <w:lvlText w:val=""/>
+      <w:lvlJc w:val="left"/>
+      <w:pPr>
+        <w:tabs>
+          <w:tab w:val="num" w:pos="4320"/>
+        </w:tabs>
+        <w:ind w:left="4320" w:hanging="360"/>
+      </w:pPr>
+      <w:rPr>
+        <w:rFonts w:ascii="Wingdings" w:hAnsi="Wingdings" w:hint="default"/>
+        <w:sz w:val="20"/>
+      </w:rPr>
+    </w:lvl>
+    <w:lvl w:ilvl="6" w:tentative="1">
+      <w:start w:val="1"/>
+      <w:numFmt w:val="bullet"/>
+      <w:lvlText w:val=""/>
+      <w:lvlJc w:val="left"/>
+      <w:pPr>
+        <w:tabs>
+          <w:tab w:val="num" w:pos="5040"/>
+        </w:tabs>
+        <w:ind w:left="5040" w:hanging="360"/>
+      </w:pPr>
+      <w:rPr>
+        <w:rFonts w:ascii="Wingdings" w:hAnsi="Wingdings" w:hint="default"/>
+        <w:sz w:val="20"/>
+      </w:rPr>
+    </w:lvl>
+    <w:lvl w:ilvl="7" w:tentative="1">
+      <w:start w:val="1"/>
+      <w:numFmt w:val="bullet"/>
+      <w:lvlText w:val=""/>
+      <w:lvlJc w:val="left"/>
+      <w:pPr>
+        <w:tabs>
+          <w:tab w:val="num" w:pos="5760"/>
+        </w:tabs>
+        <w:ind w:left="5760" w:hanging="360"/>
+      </w:pPr>
+      <w:rPr>
+        <w:rFonts w:ascii="Wingdings" w:hAnsi="Wingdings" w:hint="default"/>
+        <w:sz w:val="20"/>
+      </w:rPr>
+    </w:lvl>
+    <w:lvl w:ilvl="8" w:tentative="1">
+      <w:start w:val="1"/>
+      <w:numFmt w:val="bullet"/>
+      <w:lvlText w:val=""/>
+      <w:lvlJc w:val="left"/>
+      <w:pPr>
+        <w:tabs>
+          <w:tab w:val="num" w:pos="6480"/>
+        </w:tabs>
+        <w:ind w:left="6480" w:hanging="360"/>
+      </w:pPr>
+      <w:rPr>
+        <w:rFonts w:ascii="Wingdings" w:hAnsi="Wingdings" w:hint="default"/>
+        <w:sz w:val="20"/>
+      </w:rPr>
+    </w:lvl>
+  </w:abstractNum>
+  <w:abstractNum w:abstractNumId="4" w15:restartNumberingAfterBreak="0">
+    <w:nsid w:val="4765398F"/>
+    <w:multiLevelType w:val="multilevel"/>
+    <w:tmpl w:val="DDCA4C9E"/>
+    <w:lvl w:ilvl="0">
+      <w:start w:val="1"/>
+      <w:numFmt w:val="bullet"/>
+      <w:lvlText w:val=""/>
+      <w:lvlJc w:val="left"/>
+      <w:pPr>
+        <w:tabs>
+          <w:tab w:val="num" w:pos="720"/>
+        </w:tabs>
+        <w:ind w:left="720" w:hanging="360"/>
+      </w:pPr>
+      <w:rPr>
+        <w:rFonts w:ascii="Symbol" w:hAnsi="Symbol" w:hint="default"/>
+        <w:sz w:val="20"/>
+      </w:rPr>
+    </w:lvl>
+    <w:lvl w:ilvl="1" w:tentative="1">
+      <w:start w:val="1"/>
+      <w:numFmt w:val="bullet"/>
+      <w:lvlText w:val="o"/>
+      <w:lvlJc w:val="left"/>
+      <w:pPr>
+        <w:tabs>
+          <w:tab w:val="num" w:pos="1440"/>
+        </w:tabs>
+        <w:ind w:left="1440" w:hanging="360"/>
+      </w:pPr>
+      <w:rPr>
+        <w:rFonts w:ascii="Courier New" w:hAnsi="Courier New" w:hint="default"/>
+        <w:sz w:val="20"/>
+      </w:rPr>
+    </w:lvl>
+    <w:lvl w:ilvl="2" w:tentative="1">
+      <w:start w:val="1"/>
+      <w:numFmt w:val="bullet"/>
+      <w:lvlText w:val=""/>
+      <w:lvlJc w:val="left"/>
+      <w:pPr>
+        <w:tabs>
+          <w:tab w:val="num" w:pos="2160"/>
+        </w:tabs>
+        <w:ind w:left="2160" w:hanging="360"/>
+      </w:pPr>
+      <w:rPr>
+        <w:rFonts w:ascii="Wingdings" w:hAnsi="Wingdings" w:hint="default"/>
+        <w:sz w:val="20"/>
+      </w:rPr>
+    </w:lvl>
+    <w:lvl w:ilvl="3" w:tentative="1">
+      <w:start w:val="1"/>
+      <w:numFmt w:val="bullet"/>
+      <w:lvlText w:val=""/>
+      <w:lvlJc w:val="left"/>
+      <w:pPr>
+        <w:tabs>
+          <w:tab w:val="num" w:pos="2880"/>
+        </w:tabs>
+        <w:ind w:left="2880" w:hanging="360"/>
+      </w:pPr>
+      <w:rPr>
+        <w:rFonts w:ascii="Wingdings" w:hAnsi="Wingdings" w:hint="default"/>
+        <w:sz w:val="20"/>
+      </w:rPr>
+    </w:lvl>
+    <w:lvl w:ilvl="4" w:tentative="1">
+      <w:start w:val="1"/>
+      <w:numFmt w:val="bullet"/>
+      <w:lvlText w:val=""/>
+      <w:lvlJc w:val="left"/>
+      <w:pPr>
+        <w:tabs>
+          <w:tab w:val="num" w:pos="3600"/>
+        </w:tabs>
+        <w:ind w:left="3600" w:hanging="360"/>
+      </w:pPr>
+      <w:rPr>
+        <w:rFonts w:ascii="Wingdings" w:hAnsi="Wingdings" w:hint="default"/>
+        <w:sz w:val="20"/>
+      </w:rPr>
+    </w:lvl>
+    <w:lvl w:ilvl="5" w:tentative="1">
+      <w:start w:val="1"/>
+      <w:numFmt w:val="bullet"/>
+      <w:lvlText w:val=""/>
+      <w:lvlJc w:val="left"/>
+      <w:pPr>
+        <w:tabs>
+          <w:tab w:val="num" w:pos="4320"/>
+        </w:tabs>
+        <w:ind w:left="4320" w:hanging="360"/>
+      </w:pPr>
+      <w:rPr>
+        <w:rFonts w:ascii="Wingdings" w:hAnsi="Wingdings" w:hint="default"/>
+        <w:sz w:val="20"/>
+      </w:rPr>
+    </w:lvl>
+    <w:lvl w:ilvl="6" w:tentative="1">
+      <w:start w:val="1"/>
+      <w:numFmt w:val="bullet"/>
+      <w:lvlText w:val=""/>
+      <w:lvlJc w:val="left"/>
+      <w:pPr>
+        <w:tabs>
+          <w:tab w:val="num" w:pos="5040"/>
+        </w:tabs>
+        <w:ind w:left="5040" w:hanging="360"/>
+      </w:pPr>
+      <w:rPr>
+        <w:rFonts w:ascii="Wingdings" w:hAnsi="Wingdings" w:hint="default"/>
+        <w:sz w:val="20"/>
+      </w:rPr>
+    </w:lvl>
+    <w:lvl w:ilvl="7" w:tentative="1">
+      <w:start w:val="1"/>
+      <w:numFmt w:val="bullet"/>
+      <w:lvlText w:val=""/>
+      <w:lvlJc w:val="left"/>
+      <w:pPr>
+        <w:tabs>
+          <w:tab w:val="num" w:pos="5760"/>
+        </w:tabs>
+        <w:ind w:left="5760" w:hanging="360"/>
+      </w:pPr>
+      <w:rPr>
+        <w:rFonts w:ascii="Wingdings" w:hAnsi="Wingdings" w:hint="default"/>
+        <w:sz w:val="20"/>
+      </w:rPr>
+    </w:lvl>
+    <w:lvl w:ilvl="8" w:tentative="1">
+      <w:start w:val="1"/>
+      <w:numFmt w:val="bullet"/>
+      <w:lvlText w:val=""/>
+      <w:lvlJc w:val="left"/>
+      <w:pPr>
+        <w:tabs>
+          <w:tab w:val="num" w:pos="6480"/>
+        </w:tabs>
+        <w:ind w:left="6480" w:hanging="360"/>
+      </w:pPr>
+      <w:rPr>
+        <w:rFonts w:ascii="Wingdings" w:hAnsi="Wingdings" w:hint="default"/>
+        <w:sz w:val="20"/>
+      </w:rPr>
+    </w:lvl>
+  </w:abstractNum>
+  <w:abstractNum w:abstractNumId="5" w15:restartNumberingAfterBreak="0">
+    <w:nsid w:val="4CD974A7"/>
+    <w:multiLevelType w:val="multilevel"/>
+    <w:tmpl w:val="E3E8BCC4"/>
+    <w:lvl w:ilvl="0">
+      <w:start w:val="1"/>
+      <w:numFmt w:val="bullet"/>
+      <w:lvlText w:val=""/>
+      <w:lvlJc w:val="left"/>
+      <w:pPr>
+        <w:tabs>
+          <w:tab w:val="num" w:pos="720"/>
+        </w:tabs>
+        <w:ind w:left="720" w:hanging="360"/>
+      </w:pPr>
+      <w:rPr>
+        <w:rFonts w:ascii="Symbol" w:hAnsi="Symbol" w:hint="default"/>
+        <w:sz w:val="20"/>
+      </w:rPr>
+    </w:lvl>
+    <w:lvl w:ilvl="1" w:tentative="1">
+      <w:start w:val="1"/>
+      <w:numFmt w:val="bullet"/>
+      <w:lvlText w:val="o"/>
+      <w:lvlJc w:val="left"/>
+      <w:pPr>
+        <w:tabs>
+          <w:tab w:val="num" w:pos="1440"/>
+        </w:tabs>
+        <w:ind w:left="1440" w:hanging="360"/>
+      </w:pPr>
+      <w:rPr>
+        <w:rFonts w:ascii="Courier New" w:hAnsi="Courier New" w:hint="default"/>
+        <w:sz w:val="20"/>
+      </w:rPr>
+    </w:lvl>
+    <w:lvl w:ilvl="2" w:tentative="1">
+      <w:start w:val="1"/>
+      <w:numFmt w:val="bullet"/>
+      <w:lvlText w:val=""/>
+      <w:lvlJc w:val="left"/>
+      <w:pPr>
+        <w:tabs>
+          <w:tab w:val="num" w:pos="2160"/>
+        </w:tabs>
+        <w:ind w:left="2160" w:hanging="360"/>
+      </w:pPr>
+      <w:rPr>
+        <w:rFonts w:ascii="Wingdings" w:hAnsi="Wingdings" w:hint="default"/>
+        <w:sz w:val="20"/>
+      </w:rPr>
+    </w:lvl>
+    <w:lvl w:ilvl="3" w:tentative="1">
+      <w:start w:val="1"/>
+      <w:numFmt w:val="bullet"/>
+      <w:lvlText w:val=""/>
+      <w:lvlJc w:val="left"/>
+      <w:pPr>
+        <w:tabs>
+          <w:tab w:val="num" w:pos="2880"/>
+        </w:tabs>
+        <w:ind w:left="2880" w:hanging="360"/>
+      </w:pPr>
+      <w:rPr>
+        <w:rFonts w:ascii="Wingdings" w:hAnsi="Wingdings" w:hint="default"/>
+        <w:sz w:val="20"/>
+      </w:rPr>
+    </w:lvl>
+    <w:lvl w:ilvl="4" w:tentative="1">
+      <w:start w:val="1"/>
+      <w:numFmt w:val="bullet"/>
+      <w:lvlText w:val=""/>
+      <w:lvlJc w:val="left"/>
+      <w:pPr>
+        <w:tabs>
+          <w:tab w:val="num" w:pos="3600"/>
+        </w:tabs>
+        <w:ind w:left="3600" w:hanging="360"/>
+      </w:pPr>
+      <w:rPr>
+        <w:rFonts w:ascii="Wingdings" w:hAnsi="Wingdings" w:hint="default"/>
+        <w:sz w:val="20"/>
+      </w:rPr>
+    </w:lvl>
+    <w:lvl w:ilvl="5" w:tentative="1">
+      <w:start w:val="1"/>
+      <w:numFmt w:val="bullet"/>
+      <w:lvlText w:val=""/>
+      <w:lvlJc w:val="left"/>
+      <w:pPr>
+        <w:tabs>
+          <w:tab w:val="num" w:pos="4320"/>
+        </w:tabs>
+        <w:ind w:left="4320" w:hanging="360"/>
+      </w:pPr>
+      <w:rPr>
+        <w:rFonts w:ascii="Wingdings" w:hAnsi="Wingdings" w:hint="default"/>
+        <w:sz w:val="20"/>
+      </w:rPr>
+    </w:lvl>
+    <w:lvl w:ilvl="6" w:tentative="1">
+      <w:start w:val="1"/>
+      <w:numFmt w:val="bullet"/>
+      <w:lvlText w:val=""/>
+      <w:lvlJc w:val="left"/>
+      <w:pPr>
+        <w:tabs>
+          <w:tab w:val="num" w:pos="5040"/>
+        </w:tabs>
+        <w:ind w:left="5040" w:hanging="360"/>
+      </w:pPr>
+      <w:rPr>
+        <w:rFonts w:ascii="Wingdings" w:hAnsi="Wingdings" w:hint="default"/>
+        <w:sz w:val="20"/>
+      </w:rPr>
+    </w:lvl>
+    <w:lvl w:ilvl="7" w:tentative="1">
+      <w:start w:val="1"/>
+      <w:numFmt w:val="bullet"/>
+      <w:lvlText w:val=""/>
+      <w:lvlJc w:val="left"/>
+      <w:pPr>
+        <w:tabs>
+          <w:tab w:val="num" w:pos="5760"/>
+        </w:tabs>
+        <w:ind w:left="5760" w:hanging="360"/>
+      </w:pPr>
+      <w:rPr>
+        <w:rFonts w:ascii="Wingdings" w:hAnsi="Wingdings" w:hint="default"/>
+        <w:sz w:val="20"/>
+      </w:rPr>
+    </w:lvl>
+    <w:lvl w:ilvl="8" w:tentative="1">
+      <w:start w:val="1"/>
+      <w:numFmt w:val="bullet"/>
+      <w:lvlText w:val=""/>
+      <w:lvlJc w:val="left"/>
+      <w:pPr>
+        <w:tabs>
+          <w:tab w:val="num" w:pos="6480"/>
+        </w:tabs>
+        <w:ind w:left="6480" w:hanging="360"/>
+      </w:pPr>
+      <w:rPr>
+        <w:rFonts w:ascii="Wingdings" w:hAnsi="Wingdings" w:hint="default"/>
+        <w:sz w:val="20"/>
+      </w:rPr>
+    </w:lvl>
+  </w:abstractNum>
+  <w:abstractNum w:abstractNumId="6" w15:restartNumberingAfterBreak="0">
+    <w:nsid w:val="55F14D5C"/>
+    <w:multiLevelType w:val="multilevel"/>
+    <w:tmpl w:val="EB54AEE8"/>
+    <w:lvl w:ilvl="0">
+      <w:start w:val="1"/>
+      <w:numFmt w:val="bullet"/>
+      <w:lvlText w:val=""/>
+      <w:lvlJc w:val="left"/>
+      <w:pPr>
+        <w:tabs>
+          <w:tab w:val="num" w:pos="720"/>
+        </w:tabs>
+        <w:ind w:left="720" w:hanging="360"/>
+      </w:pPr>
+      <w:rPr>
+        <w:rFonts w:ascii="Symbol" w:hAnsi="Symbol" w:hint="default"/>
+        <w:sz w:val="20"/>
+      </w:rPr>
+    </w:lvl>
+    <w:lvl w:ilvl="1" w:tentative="1">
+      <w:start w:val="1"/>
+      <w:numFmt w:val="bullet"/>
+      <w:lvlText w:val="o"/>
+      <w:lvlJc w:val="left"/>
+      <w:pPr>
+        <w:tabs>
+          <w:tab w:val="num" w:pos="1440"/>
+        </w:tabs>
+        <w:ind w:left="1440" w:hanging="360"/>
+      </w:pPr>
+      <w:rPr>
+        <w:rFonts w:ascii="Courier New" w:hAnsi="Courier New" w:hint="default"/>
+        <w:sz w:val="20"/>
+      </w:rPr>
+    </w:lvl>
+    <w:lvl w:ilvl="2" w:tentative="1">
+      <w:start w:val="1"/>
+      <w:numFmt w:val="bullet"/>
+      <w:lvlText w:val=""/>
+      <w:lvlJc w:val="left"/>
+      <w:pPr>
+        <w:tabs>
+          <w:tab w:val="num" w:pos="2160"/>
+        </w:tabs>
+        <w:ind w:left="2160" w:hanging="360"/>
+      </w:pPr>
+      <w:rPr>
+        <w:rFonts w:ascii="Wingdings" w:hAnsi="Wingdings" w:hint="default"/>
+        <w:sz w:val="20"/>
+      </w:rPr>
+    </w:lvl>
+    <w:lvl w:ilvl="3" w:tentative="1">
+      <w:start w:val="1"/>
+      <w:numFmt w:val="bullet"/>
+      <w:lvlText w:val=""/>
+      <w:lvlJc w:val="left"/>
+      <w:pPr>
+        <w:tabs>
+          <w:tab w:val="num" w:pos="2880"/>
+        </w:tabs>
+        <w:ind w:left="2880" w:hanging="360"/>
+      </w:pPr>
+      <w:rPr>
+        <w:rFonts w:ascii="Wingdings" w:hAnsi="Wingdings" w:hint="default"/>
+        <w:sz w:val="20"/>
+      </w:rPr>
+    </w:lvl>
+    <w:lvl w:ilvl="4" w:tentative="1">
+      <w:start w:val="1"/>
+      <w:numFmt w:val="bullet"/>
+      <w:lvlText w:val=""/>
+      <w:lvlJc w:val="left"/>
+      <w:pPr>
+        <w:tabs>
+          <w:tab w:val="num" w:pos="3600"/>
+        </w:tabs>
+        <w:ind w:left="3600" w:hanging="360"/>
+      </w:pPr>
+      <w:rPr>
+        <w:rFonts w:ascii="Wingdings" w:hAnsi="Wingdings" w:hint="default"/>
+        <w:sz w:val="20"/>
+      </w:rPr>
+    </w:lvl>
+    <w:lvl w:ilvl="5" w:tentative="1">
+      <w:start w:val="1"/>
+      <w:numFmt w:val="bullet"/>
+      <w:lvlText w:val=""/>
+      <w:lvlJc w:val="left"/>
+      <w:pPr>
+        <w:tabs>
+          <w:tab w:val="num" w:pos="4320"/>
+        </w:tabs>
+        <w:ind w:left="4320" w:hanging="360"/>
+      </w:pPr>
+      <w:rPr>
+        <w:rFonts w:ascii="Wingdings" w:hAnsi="Wingdings" w:hint="default"/>
+        <w:sz w:val="20"/>
+      </w:rPr>
+    </w:lvl>
+    <w:lvl w:ilvl="6" w:tentative="1">
+      <w:start w:val="1"/>
+      <w:numFmt w:val="bullet"/>
+      <w:lvlText w:val=""/>
+      <w:lvlJc w:val="left"/>
+      <w:pPr>
+        <w:tabs>
+          <w:tab w:val="num" w:pos="5040"/>
+        </w:tabs>
+        <w:ind w:left="5040" w:hanging="360"/>
+      </w:pPr>
+      <w:rPr>
+        <w:rFonts w:ascii="Wingdings" w:hAnsi="Wingdings" w:hint="default"/>
+        <w:sz w:val="20"/>
+      </w:rPr>
+    </w:lvl>
+    <w:lvl w:ilvl="7" w:tentative="1">
+      <w:start w:val="1"/>
+      <w:numFmt w:val="bullet"/>
+      <w:lvlText w:val=""/>
+      <w:lvlJc w:val="left"/>
+      <w:pPr>
+        <w:tabs>
+          <w:tab w:val="num" w:pos="5760"/>
+        </w:tabs>
+        <w:ind w:left="5760" w:hanging="360"/>
+      </w:pPr>
+      <w:rPr>
+        <w:rFonts w:ascii="Wingdings" w:hAnsi="Wingdings" w:hint="default"/>
+        <w:sz w:val="20"/>
+      </w:rPr>
+    </w:lvl>
+    <w:lvl w:ilvl="8" w:tentative="1">
+      <w:start w:val="1"/>
+      <w:numFmt w:val="bullet"/>
+      <w:lvlText w:val=""/>
+      <w:lvlJc w:val="left"/>
+      <w:pPr>
+        <w:tabs>
+          <w:tab w:val="num" w:pos="6480"/>
+        </w:tabs>
+        <w:ind w:left="6480" w:hanging="360"/>
+      </w:pPr>
+      <w:rPr>
+        <w:rFonts w:ascii="Wingdings" w:hAnsi="Wingdings" w:hint="default"/>
+        <w:sz w:val="20"/>
+      </w:rPr>
+    </w:lvl>
+  </w:abstractNum>
+  <w:abstractNum w:abstractNumId="7" w15:restartNumberingAfterBreak="0">
+    <w:nsid w:val="7ABD6AE4"/>
+    <w:multiLevelType w:val="multilevel"/>
+    <w:tmpl w:val="E75689E2"/>
+    <w:lvl w:ilvl="0">
+      <w:start w:val="1"/>
+      <w:numFmt w:val="bullet"/>
+      <w:lvlText w:val=""/>
+      <w:lvlJc w:val="left"/>
+      <w:pPr>
+        <w:tabs>
+          <w:tab w:val="num" w:pos="720"/>
+        </w:tabs>
+        <w:ind w:left="720" w:hanging="360"/>
+      </w:pPr>
+      <w:rPr>
+        <w:rFonts w:ascii="Symbol" w:hAnsi="Symbol" w:hint="default"/>
+        <w:sz w:val="20"/>
+      </w:rPr>
+    </w:lvl>
+    <w:lvl w:ilvl="1" w:tentative="1">
+      <w:start w:val="1"/>
+      <w:numFmt w:val="bullet"/>
+      <w:lvlText w:val="o"/>
+      <w:lvlJc w:val="left"/>
+      <w:pPr>
+        <w:tabs>
+          <w:tab w:val="num" w:pos="1440"/>
+        </w:tabs>
+        <w:ind w:left="1440" w:hanging="360"/>
+      </w:pPr>
+      <w:rPr>
+        <w:rFonts w:ascii="Courier New" w:hAnsi="Courier New" w:hint="default"/>
+        <w:sz w:val="20"/>
+      </w:rPr>
+    </w:lvl>
+    <w:lvl w:ilvl="2" w:tentative="1">
+      <w:start w:val="1"/>
+      <w:numFmt w:val="bullet"/>
+      <w:lvlText w:val=""/>
+      <w:lvlJc w:val="left"/>
+      <w:pPr>
+        <w:tabs>
+          <w:tab w:val="num" w:pos="2160"/>
+        </w:tabs>
+        <w:ind w:left="2160" w:hanging="360"/>
+      </w:pPr>
+      <w:rPr>
+        <w:rFonts w:ascii="Wingdings" w:hAnsi="Wingdings" w:hint="default"/>
+        <w:sz w:val="20"/>
+      </w:rPr>
+    </w:lvl>
+    <w:lvl w:ilvl="3" w:tentative="1">
+      <w:start w:val="1"/>
+      <w:numFmt w:val="bullet"/>
+      <w:lvlText w:val=""/>
+      <w:lvlJc w:val="left"/>
+      <w:pPr>
+        <w:tabs>
+          <w:tab w:val="num" w:pos="2880"/>
+        </w:tabs>
+        <w:ind w:left="2880" w:hanging="360"/>
+      </w:pPr>
+      <w:rPr>
+        <w:rFonts w:ascii="Wingdings" w:hAnsi="Wingdings" w:hint="default"/>
+        <w:sz w:val="20"/>
+      </w:rPr>
+    </w:lvl>
+    <w:lvl w:ilvl="4" w:tentative="1">
+      <w:start w:val="1"/>
+      <w:numFmt w:val="bullet"/>
+      <w:lvlText w:val=""/>
+      <w:lvlJc w:val="left"/>
+      <w:pPr>
+        <w:tabs>
+          <w:tab w:val="num" w:pos="3600"/>
+        </w:tabs>
+        <w:ind w:left="3600" w:hanging="360"/>
+      </w:pPr>
+      <w:rPr>
+        <w:rFonts w:ascii="Wingdings" w:hAnsi="Wingdings" w:hint="default"/>
+        <w:sz w:val="20"/>
+      </w:rPr>
+    </w:lvl>
+    <w:lvl w:ilvl="5" w:tentative="1">
+      <w:start w:val="1"/>
+      <w:numFmt w:val="bullet"/>
+      <w:lvlText w:val=""/>
+      <w:lvlJc w:val="left"/>
+      <w:pPr>
+        <w:tabs>
+          <w:tab w:val="num" w:pos="4320"/>
+        </w:tabs>
+        <w:ind w:left="4320" w:hanging="360"/>
+      </w:pPr>
+      <w:rPr>
+        <w:rFonts w:ascii="Wingdings" w:hAnsi="Wingdings" w:hint="default"/>
+        <w:sz w:val="20"/>
+      </w:rPr>
+    </w:lvl>
+    <w:lvl w:ilvl="6" w:tentative="1">
+      <w:start w:val="1"/>
+      <w:numFmt w:val="bullet"/>
+      <w:lvlText w:val=""/>
+      <w:lvlJc w:val="left"/>
+      <w:pPr>
+        <w:tabs>
+          <w:tab w:val="num" w:pos="5040"/>
+        </w:tabs>
+        <w:ind w:left="5040" w:hanging="360"/>
+      </w:pPr>
+      <w:rPr>
+        <w:rFonts w:ascii="Wingdings" w:hAnsi="Wingdings" w:hint="default"/>
+        <w:sz w:val="20"/>
+      </w:rPr>
+    </w:lvl>
+    <w:lvl w:ilvl="7" w:tentative="1">
+      <w:start w:val="1"/>
+      <w:numFmt w:val="bullet"/>
+      <w:lvlText w:val=""/>
+      <w:lvlJc w:val="left"/>
+      <w:pPr>
+        <w:tabs>
+          <w:tab w:val="num" w:pos="5760"/>
+        </w:tabs>
+        <w:ind w:left="5760" w:hanging="360"/>
+      </w:pPr>
+      <w:rPr>
+        <w:rFonts w:ascii="Wingdings" w:hAnsi="Wingdings" w:hint="default"/>
+        <w:sz w:val="20"/>
+      </w:rPr>
+    </w:lvl>
+    <w:lvl w:ilvl="8" w:tentative="1">
+      <w:start w:val="1"/>
+      <w:numFmt w:val="bullet"/>
+      <w:lvlText w:val=""/>
+      <w:lvlJc w:val="left"/>
+      <w:pPr>
+        <w:tabs>
+          <w:tab w:val="num" w:pos="6480"/>
+        </w:tabs>
+        <w:ind w:left="6480" w:hanging="360"/>
+      </w:pPr>
+      <w:rPr>
+        <w:rFonts w:ascii="Wingdings" w:hAnsi="Wingdings" w:hint="default"/>
+        <w:sz w:val="20"/>
+      </w:rPr>
+    </w:lvl>
+  </w:abstractNum>
+  <w:abstractNum w:abstractNumId="8" w15:restartNumberingAfterBreak="0">
+    <w:nsid w:val="7C5B7739"/>
+    <w:multiLevelType w:val="multilevel"/>
+    <w:tmpl w:val="2C02AABA"/>
+    <w:lvl w:ilvl="0">
+      <w:start w:val="1"/>
+      <w:numFmt w:val="bullet"/>
+      <w:lvlText w:val=""/>
+      <w:lvlJc w:val="left"/>
+      <w:pPr>
+        <w:tabs>
+          <w:tab w:val="num" w:pos="720"/>
+        </w:tabs>
+        <w:ind w:left="720" w:hanging="360"/>
+      </w:pPr>
+      <w:rPr>
+        <w:rFonts w:ascii="Symbol" w:hAnsi="Symbol" w:hint="default"/>
+        <w:sz w:val="20"/>
+      </w:rPr>
+    </w:lvl>
+    <w:lvl w:ilvl="1" w:tentative="1">
+      <w:start w:val="1"/>
+      <w:numFmt w:val="bullet"/>
+      <w:lvlText w:val="o"/>
+      <w:lvlJc w:val="left"/>
+      <w:pPr>
+        <w:tabs>
+          <w:tab w:val="num" w:pos="1440"/>
+        </w:tabs>
+        <w:ind w:left="1440" w:hanging="360"/>
+      </w:pPr>
+      <w:rPr>
+        <w:rFonts w:ascii="Courier New" w:hAnsi="Courier New" w:hint="default"/>
+        <w:sz w:val="20"/>
+      </w:rPr>
+    </w:lvl>
+    <w:lvl w:ilvl="2" w:tentative="1">
+      <w:start w:val="1"/>
+      <w:numFmt w:val="bullet"/>
+      <w:lvlText w:val=""/>
+      <w:lvlJc w:val="left"/>
+      <w:pPr>
+        <w:tabs>
+          <w:tab w:val="num" w:pos="2160"/>
+        </w:tabs>
+        <w:ind w:left="2160" w:hanging="360"/>
+      </w:pPr>
+      <w:rPr>
+        <w:rFonts w:ascii="Wingdings" w:hAnsi="Wingdings" w:hint="default"/>
+        <w:sz w:val="20"/>
+      </w:rPr>
+    </w:lvl>
+    <w:lvl w:ilvl="3" w:tentative="1">
+      <w:start w:val="1"/>
+      <w:numFmt w:val="bullet"/>
+      <w:lvlText w:val=""/>
+      <w:lvlJc w:val="left"/>
+      <w:pPr>
+        <w:tabs>
+          <w:tab w:val="num" w:pos="2880"/>
+        </w:tabs>
+        <w:ind w:left="2880" w:hanging="360"/>
+      </w:pPr>
+      <w:rPr>
+        <w:rFonts w:ascii="Wingdings" w:hAnsi="Wingdings" w:hint="default"/>
+        <w:sz w:val="20"/>
+      </w:rPr>
+    </w:lvl>
+    <w:lvl w:ilvl="4" w:tentative="1">
+      <w:start w:val="1"/>
+      <w:numFmt w:val="bullet"/>
+      <w:lvlText w:val=""/>
+      <w:lvlJc w:val="left"/>
+      <w:pPr>
+        <w:tabs>
+          <w:tab w:val="num" w:pos="3600"/>
+        </w:tabs>
+        <w:ind w:left="3600" w:hanging="360"/>
+      </w:pPr>
+      <w:rPr>
+        <w:rFonts w:ascii="Wingdings" w:hAnsi="Wingdings" w:hint="default"/>
+        <w:sz w:val="20"/>
+      </w:rPr>
+    </w:lvl>
+    <w:lvl w:ilvl="5" w:tentative="1">
+      <w:start w:val="1"/>
+      <w:numFmt w:val="bullet"/>
+      <w:lvlText w:val=""/>
+      <w:lvlJc w:val="left"/>
+      <w:pPr>
+        <w:tabs>
+          <w:tab w:val="num" w:pos="4320"/>
+        </w:tabs>
+        <w:ind w:left="4320" w:hanging="360"/>
+      </w:pPr>
+      <w:rPr>
+        <w:rFonts w:ascii="Wingdings" w:hAnsi="Wingdings" w:hint="default"/>
+        <w:sz w:val="20"/>
+      </w:rPr>
+    </w:lvl>
+    <w:lvl w:ilvl="6" w:tentative="1">
+      <w:start w:val="1"/>
+      <w:numFmt w:val="bullet"/>
+      <w:lvlText w:val=""/>
+      <w:lvlJc w:val="left"/>
+      <w:pPr>
+        <w:tabs>
+          <w:tab w:val="num" w:pos="5040"/>
+        </w:tabs>
+        <w:ind w:left="5040" w:hanging="360"/>
+      </w:pPr>
+      <w:rPr>
+        <w:rFonts w:ascii="Wingdings" w:hAnsi="Wingdings" w:hint="default"/>
+        <w:sz w:val="20"/>
+      </w:rPr>
+    </w:lvl>
+    <w:lvl w:ilvl="7" w:tentative="1">
+      <w:start w:val="1"/>
+      <w:numFmt w:val="bullet"/>
+      <w:lvlText w:val=""/>
+      <w:lvlJc w:val="left"/>
+      <w:pPr>
+        <w:tabs>
+          <w:tab w:val="num" w:pos="5760"/>
+        </w:tabs>
+        <w:ind w:left="5760" w:hanging="360"/>
+      </w:pPr>
+      <w:rPr>
+        <w:rFonts w:ascii="Wingdings" w:hAnsi="Wingdings" w:hint="default"/>
+        <w:sz w:val="20"/>
+      </w:rPr>
+    </w:lvl>
+    <w:lvl w:ilvl="8" w:tentative="1">
+      <w:start w:val="1"/>
+      <w:numFmt w:val="bullet"/>
+      <w:lvlText w:val=""/>
+      <w:lvlJc w:val="left"/>
+      <w:pPr>
+        <w:tabs>
+          <w:tab w:val="num" w:pos="6480"/>
+        </w:tabs>
+        <w:ind w:left="6480" w:hanging="360"/>
+      </w:pPr>
+      <w:rPr>
+        <w:rFonts w:ascii="Wingdings" w:hAnsi="Wingdings" w:hint="default"/>
+        <w:sz w:val="20"/>
+      </w:rPr>
+    </w:lvl>
+  </w:abstractNum>
+  <w:num w:numId="1" w16cid:durableId="1255555809">
+    <w:abstractNumId w:val="6"/>
+  </w:num>
+  <w:num w:numId="2" w16cid:durableId="680667886">
+    <w:abstractNumId w:val="8"/>
+  </w:num>
+  <w:num w:numId="3" w16cid:durableId="64569661">
+    <w:abstractNumId w:val="1"/>
+  </w:num>
+  <w:num w:numId="4" w16cid:durableId="286935943">
+    <w:abstractNumId w:val="7"/>
+  </w:num>
+  <w:num w:numId="5" w16cid:durableId="1402290538">
+    <w:abstractNumId w:val="4"/>
+  </w:num>
+  <w:num w:numId="6" w16cid:durableId="648242063">
+    <w:abstractNumId w:val="2"/>
+  </w:num>
+  <w:num w:numId="7" w16cid:durableId="773331492">
+    <w:abstractNumId w:val="3"/>
+  </w:num>
+  <w:num w:numId="8" w16cid:durableId="1042630554">
+    <w:abstractNumId w:val="0"/>
+  </w:num>
+  <w:num w:numId="9" w16cid:durableId="785733317">
+    <w:abstractNumId w:val="5"/>
+  </w:num>
+</w:numbering>
 </file>
 
 <file path=word/styles.xml><?xml version="1.0" encoding="utf-8"?>
@@ -616,7 +3316,6 @@
   <w:style w:type="character" w:default="1" w:styleId="DefaultParagraphFont">
     <w:name w:val="Default Paragraph Font"/>
     <w:uiPriority w:val="1"/>
-    <w:semiHidden/>
     <w:unhideWhenUsed/>
   </w:style>
   <w:style w:type="table" w:default="1" w:styleId="TableNormal">

</xml_diff>